<commit_message>
Correções à validação da ViT
</commit_message>
<xml_diff>
--- a/Documentation/Experimentos com Vision Transformer.docx
+++ b/Documentation/Experimentos com Vision Transformer.docx
@@ -80,8 +80,17 @@
           <w:b/>
           <w:bCs/>
         </w:rPr>
-        <w:t>Validação inicial da Vision Transformer</w:t>
-      </w:r>
+        <w:t xml:space="preserve">Validação inicial da Vision </w:t>
+      </w:r>
+      <w:proofErr w:type="spellStart"/>
+      <w:r>
+        <w:rPr>
+          <w:b/>
+          <w:bCs/>
+        </w:rPr>
+        <w:t>Transformer</w:t>
+      </w:r>
+      <w:proofErr w:type="spellEnd"/>
       <w:r>
         <w:rPr>
           <w:b/>
@@ -146,7 +155,15 @@
         <w:jc w:val="both"/>
       </w:pPr>
       <w:r>
-        <w:t>Foram feitas modificações para implementar puramente a Vision Transformer (retirando qua</w:t>
+        <w:t xml:space="preserve">Foram feitas modificações para implementar puramente a Vision </w:t>
+      </w:r>
+      <w:proofErr w:type="spellStart"/>
+      <w:r>
+        <w:t>Transformer</w:t>
+      </w:r>
+      <w:proofErr w:type="spellEnd"/>
+      <w:r>
+        <w:t xml:space="preserve"> (retirando qua</w:t>
       </w:r>
       <w:r>
         <w:t>is</w:t>
@@ -167,10 +184,26 @@
         <w:t xml:space="preserve"> a estrutura </w:t>
       </w:r>
       <w:r>
-        <w:t xml:space="preserve">da ViT permanece </w:t>
-      </w:r>
-      <w:r>
-        <w:t>inalterada (inclusive para manter compatibilidade com os pesos pré-treinados).</w:t>
+        <w:t xml:space="preserve">da </w:t>
+      </w:r>
+      <w:proofErr w:type="spellStart"/>
+      <w:r>
+        <w:t>ViT</w:t>
+      </w:r>
+      <w:proofErr w:type="spellEnd"/>
+      <w:r>
+        <w:t xml:space="preserve"> permanece </w:t>
+      </w:r>
+      <w:r>
+        <w:t xml:space="preserve">inalterada (inclusive para manter compatibilidade com os pesos </w:t>
+      </w:r>
+      <w:proofErr w:type="spellStart"/>
+      <w:r>
+        <w:t>pré</w:t>
+      </w:r>
+      <w:proofErr w:type="spellEnd"/>
+      <w:r>
+        <w:t>-treinados).</w:t>
       </w:r>
     </w:p>
     <w:p>
@@ -185,7 +218,15 @@
         <w:t>Os p</w:t>
       </w:r>
       <w:r>
-        <w:t>esos pré-treinados com a ImageNet-21K também foram retirados</w:t>
+        <w:t xml:space="preserve">esos </w:t>
+      </w:r>
+      <w:proofErr w:type="spellStart"/>
+      <w:r>
+        <w:t>pré</w:t>
+      </w:r>
+      <w:proofErr w:type="spellEnd"/>
+      <w:r>
+        <w:t>-treinados com a ImageNet-21K também foram retirados</w:t>
       </w:r>
       <w:r>
         <w:t xml:space="preserve"> diretamente</w:t>
@@ -252,8 +293,17 @@
           <w:sz w:val="18"/>
           <w:szCs w:val="18"/>
         </w:rPr>
-        <w:t xml:space="preserve"> fine-tunning</w:t>
-      </w:r>
+        <w:t xml:space="preserve"> fine-</w:t>
+      </w:r>
+      <w:proofErr w:type="spellStart"/>
+      <w:r>
+        <w:rPr>
+          <w:sz w:val="18"/>
+          <w:szCs w:val="18"/>
+        </w:rPr>
+        <w:t>tunning</w:t>
+      </w:r>
+      <w:proofErr w:type="spellEnd"/>
     </w:p>
     <w:p>
       <w:pPr>
@@ -402,7 +452,39 @@
           <w:i/>
           <w:iCs/>
         </w:rPr>
-        <w:t>[004700/10000] loss=1.6713, acc=0.5625</w:t>
+        <w:t xml:space="preserve">[004700/10000] </w:t>
+      </w:r>
+      <w:proofErr w:type="spellStart"/>
+      <w:r>
+        <w:rPr>
+          <w:i/>
+          <w:iCs/>
+        </w:rPr>
+        <w:t>loss</w:t>
+      </w:r>
+      <w:proofErr w:type="spellEnd"/>
+      <w:r>
+        <w:rPr>
+          <w:i/>
+          <w:iCs/>
+        </w:rPr>
+        <w:t xml:space="preserve">=1.6713, </w:t>
+      </w:r>
+      <w:proofErr w:type="spellStart"/>
+      <w:r>
+        <w:rPr>
+          <w:i/>
+          <w:iCs/>
+        </w:rPr>
+        <w:t>acc</w:t>
+      </w:r>
+      <w:proofErr w:type="spellEnd"/>
+      <w:r>
+        <w:rPr>
+          <w:i/>
+          <w:iCs/>
+        </w:rPr>
+        <w:t>=0.5625</w:t>
       </w:r>
     </w:p>
     <w:p>
@@ -420,7 +502,39 @@
           <w:i/>
           <w:iCs/>
         </w:rPr>
-        <w:t>[004800/10000] loss=1.9858, acc=0.5625</w:t>
+        <w:t xml:space="preserve">[004800/10000] </w:t>
+      </w:r>
+      <w:proofErr w:type="spellStart"/>
+      <w:r>
+        <w:rPr>
+          <w:i/>
+          <w:iCs/>
+        </w:rPr>
+        <w:t>loss</w:t>
+      </w:r>
+      <w:proofErr w:type="spellEnd"/>
+      <w:r>
+        <w:rPr>
+          <w:i/>
+          <w:iCs/>
+        </w:rPr>
+        <w:t xml:space="preserve">=1.9858, </w:t>
+      </w:r>
+      <w:proofErr w:type="spellStart"/>
+      <w:r>
+        <w:rPr>
+          <w:i/>
+          <w:iCs/>
+        </w:rPr>
+        <w:t>acc</w:t>
+      </w:r>
+      <w:proofErr w:type="spellEnd"/>
+      <w:r>
+        <w:rPr>
+          <w:i/>
+          <w:iCs/>
+        </w:rPr>
+        <w:t>=0.5625</w:t>
       </w:r>
     </w:p>
     <w:p>
@@ -438,7 +552,39 @@
           <w:i/>
           <w:iCs/>
         </w:rPr>
-        <w:t>[004900/10000] loss=0.6557, acc=0.8750</w:t>
+        <w:t xml:space="preserve">[004900/10000] </w:t>
+      </w:r>
+      <w:proofErr w:type="spellStart"/>
+      <w:r>
+        <w:rPr>
+          <w:i/>
+          <w:iCs/>
+        </w:rPr>
+        <w:t>loss</w:t>
+      </w:r>
+      <w:proofErr w:type="spellEnd"/>
+      <w:r>
+        <w:rPr>
+          <w:i/>
+          <w:iCs/>
+        </w:rPr>
+        <w:t xml:space="preserve">=0.6557, </w:t>
+      </w:r>
+      <w:proofErr w:type="spellStart"/>
+      <w:r>
+        <w:rPr>
+          <w:i/>
+          <w:iCs/>
+        </w:rPr>
+        <w:t>acc</w:t>
+      </w:r>
+      <w:proofErr w:type="spellEnd"/>
+      <w:r>
+        <w:rPr>
+          <w:i/>
+          <w:iCs/>
+        </w:rPr>
+        <w:t>=0.8750</w:t>
       </w:r>
     </w:p>
     <w:p>
@@ -456,7 +602,39 @@
           <w:i/>
           <w:iCs/>
         </w:rPr>
-        <w:t>[005000/10000] loss=1.9197, acc=0.4375</w:t>
+        <w:t xml:space="preserve">[005000/10000] </w:t>
+      </w:r>
+      <w:proofErr w:type="spellStart"/>
+      <w:r>
+        <w:rPr>
+          <w:i/>
+          <w:iCs/>
+        </w:rPr>
+        <w:t>loss</w:t>
+      </w:r>
+      <w:proofErr w:type="spellEnd"/>
+      <w:r>
+        <w:rPr>
+          <w:i/>
+          <w:iCs/>
+        </w:rPr>
+        <w:t xml:space="preserve">=1.9197, </w:t>
+      </w:r>
+      <w:proofErr w:type="spellStart"/>
+      <w:r>
+        <w:rPr>
+          <w:i/>
+          <w:iCs/>
+        </w:rPr>
+        <w:t>acc</w:t>
+      </w:r>
+      <w:proofErr w:type="spellEnd"/>
+      <w:r>
+        <w:rPr>
+          <w:i/>
+          <w:iCs/>
+        </w:rPr>
+        <w:t>=0.4375</w:t>
       </w:r>
     </w:p>
     <w:p>
@@ -475,8 +653,33 @@
           <w:iCs/>
         </w:rPr>
         <w:lastRenderedPageBreak/>
-        <w:t xml:space="preserve">  File "C:\Users\marci_plgx30x\Desktop\Arquivos\Projetos do Mestrado (Git)\Projeto-Classificadores\Network_Validation\Process_ImageNet.py", line 324, in load_tfrecords</w:t>
-      </w:r>
+        <w:t xml:space="preserve">  File "C:\Users\marci_plgx30x\Desktop\Arquivos\Projetos do Mestrado (Git)\Projeto-Classificadores\Network_Validation\Process_ImageNet.py", </w:t>
+      </w:r>
+      <w:proofErr w:type="spellStart"/>
+      <w:r>
+        <w:rPr>
+          <w:i/>
+          <w:iCs/>
+        </w:rPr>
+        <w:t>line</w:t>
+      </w:r>
+      <w:proofErr w:type="spellEnd"/>
+      <w:r>
+        <w:rPr>
+          <w:i/>
+          <w:iCs/>
+        </w:rPr>
+        <w:t xml:space="preserve"> 324, in </w:t>
+      </w:r>
+      <w:proofErr w:type="spellStart"/>
+      <w:r>
+        <w:rPr>
+          <w:i/>
+          <w:iCs/>
+        </w:rPr>
+        <w:t>load_tfrecords</w:t>
+      </w:r>
+      <w:proofErr w:type="spellEnd"/>
     </w:p>
     <w:p>
       <w:pPr>
@@ -493,7 +696,87 @@
           <w:i/>
           <w:iCs/>
         </w:rPr>
-        <w:t xml:space="preserve">    raise ValueError(f"Nenhum TFRecord encontrado em: {tfrecord_dir}/{split}")</w:t>
+        <w:t xml:space="preserve">    </w:t>
+      </w:r>
+      <w:proofErr w:type="spellStart"/>
+      <w:r>
+        <w:rPr>
+          <w:i/>
+          <w:iCs/>
+        </w:rPr>
+        <w:t>raise</w:t>
+      </w:r>
+      <w:proofErr w:type="spellEnd"/>
+      <w:r>
+        <w:rPr>
+          <w:i/>
+          <w:iCs/>
+        </w:rPr>
+        <w:t xml:space="preserve"> </w:t>
+      </w:r>
+      <w:proofErr w:type="spellStart"/>
+      <w:r>
+        <w:rPr>
+          <w:i/>
+          <w:iCs/>
+        </w:rPr>
+        <w:t>ValueError</w:t>
+      </w:r>
+      <w:proofErr w:type="spellEnd"/>
+      <w:r>
+        <w:rPr>
+          <w:i/>
+          <w:iCs/>
+        </w:rPr>
+        <w:t>(</w:t>
+      </w:r>
+      <w:proofErr w:type="spellStart"/>
+      <w:r>
+        <w:rPr>
+          <w:i/>
+          <w:iCs/>
+        </w:rPr>
+        <w:t>f"Nenhum</w:t>
+      </w:r>
+      <w:proofErr w:type="spellEnd"/>
+      <w:r>
+        <w:rPr>
+          <w:i/>
+          <w:iCs/>
+        </w:rPr>
+        <w:t xml:space="preserve"> </w:t>
+      </w:r>
+      <w:proofErr w:type="spellStart"/>
+      <w:r>
+        <w:rPr>
+          <w:i/>
+          <w:iCs/>
+        </w:rPr>
+        <w:t>TFRecord</w:t>
+      </w:r>
+      <w:proofErr w:type="spellEnd"/>
+      <w:r>
+        <w:rPr>
+          <w:i/>
+          <w:iCs/>
+        </w:rPr>
+        <w:t xml:space="preserve"> encontrado em: {</w:t>
+      </w:r>
+      <w:proofErr w:type="spellStart"/>
+      <w:r>
+        <w:rPr>
+          <w:i/>
+          <w:iCs/>
+        </w:rPr>
+        <w:t>tfrecord_dir</w:t>
+      </w:r>
+      <w:proofErr w:type="spellEnd"/>
+      <w:r>
+        <w:rPr>
+          <w:i/>
+          <w:iCs/>
+        </w:rPr>
+        <w:t>}/{split}")</w:t>
       </w:r>
     </w:p>
     <w:p>
@@ -506,13 +789,95 @@
           <w:iCs/>
         </w:rPr>
       </w:pPr>
-      <w:r>
-        <w:rPr>
-          <w:i/>
-          <w:iCs/>
-        </w:rPr>
-        <w:t>ValueError: Nenhum TFRecord encontrado em: &lt;tensorflow.python.data.ops.iterator_ops.OwnedIterator object at 0x000001BDCDA64430&gt;/validation</w:t>
-      </w:r>
+      <w:proofErr w:type="spellStart"/>
+      <w:r>
+        <w:rPr>
+          <w:i/>
+          <w:iCs/>
+        </w:rPr>
+        <w:t>ValueError</w:t>
+      </w:r>
+      <w:proofErr w:type="spellEnd"/>
+      <w:r>
+        <w:rPr>
+          <w:i/>
+          <w:iCs/>
+        </w:rPr>
+        <w:t xml:space="preserve">: Nenhum </w:t>
+      </w:r>
+      <w:proofErr w:type="spellStart"/>
+      <w:r>
+        <w:rPr>
+          <w:i/>
+          <w:iCs/>
+        </w:rPr>
+        <w:t>TFRecord</w:t>
+      </w:r>
+      <w:proofErr w:type="spellEnd"/>
+      <w:r>
+        <w:rPr>
+          <w:i/>
+          <w:iCs/>
+        </w:rPr>
+        <w:t xml:space="preserve"> encontrado em: &lt;</w:t>
+      </w:r>
+      <w:proofErr w:type="spellStart"/>
+      <w:r>
+        <w:rPr>
+          <w:i/>
+          <w:iCs/>
+        </w:rPr>
+        <w:t>tensorflow.python.data.ops.iterator_ops.OwnedIterator</w:t>
+      </w:r>
+      <w:proofErr w:type="spellEnd"/>
+      <w:r>
+        <w:rPr>
+          <w:i/>
+          <w:iCs/>
+        </w:rPr>
+        <w:t xml:space="preserve"> </w:t>
+      </w:r>
+      <w:proofErr w:type="spellStart"/>
+      <w:r>
+        <w:rPr>
+          <w:i/>
+          <w:iCs/>
+        </w:rPr>
+        <w:t>object</w:t>
+      </w:r>
+      <w:proofErr w:type="spellEnd"/>
+      <w:r>
+        <w:rPr>
+          <w:i/>
+          <w:iCs/>
+        </w:rPr>
+        <w:t xml:space="preserve"> </w:t>
+      </w:r>
+      <w:proofErr w:type="spellStart"/>
+      <w:r>
+        <w:rPr>
+          <w:i/>
+          <w:iCs/>
+        </w:rPr>
+        <w:t>at</w:t>
+      </w:r>
+      <w:proofErr w:type="spellEnd"/>
+      <w:r>
+        <w:rPr>
+          <w:i/>
+          <w:iCs/>
+        </w:rPr>
+        <w:t xml:space="preserve"> 0x000001BDCDA64430&gt;/</w:t>
+      </w:r>
+      <w:proofErr w:type="spellStart"/>
+      <w:r>
+        <w:rPr>
+          <w:i/>
+          <w:iCs/>
+        </w:rPr>
+        <w:t>validation</w:t>
+      </w:r>
+      <w:proofErr w:type="spellEnd"/>
     </w:p>
     <w:p>
       <w:pPr>
@@ -535,12 +900,85 @@
           <w:iCs/>
         </w:rPr>
       </w:pPr>
-      <w:r>
-        <w:rPr>
-          <w:i/>
-          <w:iCs/>
-        </w:rPr>
-        <w:t>Process finished with exit code 1</w:t>
+      <w:proofErr w:type="spellStart"/>
+      <w:r>
+        <w:rPr>
+          <w:i/>
+          <w:iCs/>
+        </w:rPr>
+        <w:t>Process</w:t>
+      </w:r>
+      <w:proofErr w:type="spellEnd"/>
+      <w:r>
+        <w:rPr>
+          <w:i/>
+          <w:iCs/>
+        </w:rPr>
+        <w:t xml:space="preserve"> </w:t>
+      </w:r>
+      <w:proofErr w:type="spellStart"/>
+      <w:r>
+        <w:rPr>
+          <w:i/>
+          <w:iCs/>
+        </w:rPr>
+        <w:t>finished</w:t>
+      </w:r>
+      <w:proofErr w:type="spellEnd"/>
+      <w:r>
+        <w:rPr>
+          <w:i/>
+          <w:iCs/>
+        </w:rPr>
+        <w:t xml:space="preserve"> </w:t>
+      </w:r>
+      <w:proofErr w:type="spellStart"/>
+      <w:r>
+        <w:rPr>
+          <w:i/>
+          <w:iCs/>
+        </w:rPr>
+        <w:t>with</w:t>
+      </w:r>
+      <w:proofErr w:type="spellEnd"/>
+      <w:r>
+        <w:rPr>
+          <w:i/>
+          <w:iCs/>
+        </w:rPr>
+        <w:t xml:space="preserve"> </w:t>
+      </w:r>
+      <w:proofErr w:type="spellStart"/>
+      <w:r>
+        <w:rPr>
+          <w:i/>
+          <w:iCs/>
+        </w:rPr>
+        <w:t>exit</w:t>
+      </w:r>
+      <w:proofErr w:type="spellEnd"/>
+      <w:r>
+        <w:rPr>
+          <w:i/>
+          <w:iCs/>
+        </w:rPr>
+        <w:t xml:space="preserve"> </w:t>
+      </w:r>
+      <w:proofErr w:type="spellStart"/>
+      <w:r>
+        <w:rPr>
+          <w:i/>
+          <w:iCs/>
+        </w:rPr>
+        <w:t>code</w:t>
+      </w:r>
+      <w:proofErr w:type="spellEnd"/>
+      <w:r>
+        <w:rPr>
+          <w:i/>
+          <w:iCs/>
+        </w:rPr>
+        <w:t xml:space="preserve"> 1</w:t>
       </w:r>
     </w:p>
     <w:p>
@@ -586,12 +1024,21 @@
       <w:r>
         <w:t xml:space="preserve">O erro ocorre na função </w:t>
       </w:r>
-      <w:r>
-        <w:rPr>
-          <w:i/>
-          <w:iCs/>
-        </w:rPr>
-        <w:t>train_vit(</w:t>
+      <w:proofErr w:type="spellStart"/>
+      <w:r>
+        <w:rPr>
+          <w:i/>
+          <w:iCs/>
+        </w:rPr>
+        <w:t>train_vit</w:t>
+      </w:r>
+      <w:proofErr w:type="spellEnd"/>
+      <w:r>
+        <w:rPr>
+          <w:i/>
+          <w:iCs/>
+        </w:rPr>
+        <w:t>(</w:t>
       </w:r>
       <w:r>
         <w:rPr>
@@ -641,7 +1088,15 @@
         <w:jc w:val="both"/>
       </w:pPr>
       <w:r>
-        <w:t>Avaliação standalone (checkpoint + path)</w:t>
+        <w:t xml:space="preserve">Avaliação </w:t>
+      </w:r>
+      <w:proofErr w:type="spellStart"/>
+      <w:r>
+        <w:t>standalone</w:t>
+      </w:r>
+      <w:proofErr w:type="spellEnd"/>
+      <w:r>
+        <w:t xml:space="preserve"> (checkpoint + path)</w:t>
       </w:r>
       <w:r>
         <w:t>, comumente utilizada</w:t>
@@ -663,7 +1118,15 @@
         <w:jc w:val="both"/>
       </w:pPr>
       <w:r>
-        <w:t>Avaliação durante treino (iterator)</w:t>
+        <w:t>Avaliação durante treino (</w:t>
+      </w:r>
+      <w:proofErr w:type="spellStart"/>
+      <w:r>
+        <w:t>iterator</w:t>
+      </w:r>
+      <w:proofErr w:type="spellEnd"/>
+      <w:r>
+        <w:t>)</w:t>
       </w:r>
       <w:r>
         <w:t>, comumente utilizada</w:t>
@@ -854,12 +1317,21 @@
       <w:r>
         <w:t xml:space="preserve">A correção deste problema envolve a criação de uma nova função: </w:t>
       </w:r>
-      <w:r>
-        <w:rPr>
-          <w:i/>
-          <w:iCs/>
-        </w:rPr>
-        <w:t>evaluate_vit_from_iterator(</w:t>
+      <w:proofErr w:type="spellStart"/>
+      <w:r>
+        <w:rPr>
+          <w:i/>
+          <w:iCs/>
+        </w:rPr>
+        <w:t>evaluate_vit_from_iterator</w:t>
+      </w:r>
+      <w:proofErr w:type="spellEnd"/>
+      <w:r>
+        <w:rPr>
+          <w:i/>
+          <w:iCs/>
+        </w:rPr>
+        <w:t>(</w:t>
       </w:r>
       <w:r>
         <w:rPr>
@@ -890,6 +1362,7 @@
       <w:r>
         <w:t xml:space="preserve"> </w:t>
       </w:r>
+      <w:proofErr w:type="spellStart"/>
       <w:r>
         <w:rPr>
           <w:i/>
@@ -897,6 +1370,7 @@
         </w:rPr>
         <w:t>load_tfrecords</w:t>
       </w:r>
+      <w:proofErr w:type="spellEnd"/>
       <w:r>
         <w:rPr>
           <w:i/>
@@ -966,7 +1440,55 @@
         <w:t xml:space="preserve">logs do treinamento podem ser conferidos arquivo ‘logs pycharm.txt’ no diretório </w:t>
       </w:r>
       <w:r>
-        <w:t>"\Projeto-Classificadores\Main_Validation\Vision Transformers\Results\Experimento 1 - ViT\Experimento 1 -ViT- Sanity Check - LOG.txt"</w:t>
+        <w:t>"\Projeto-Classificadores\</w:t>
+      </w:r>
+      <w:proofErr w:type="spellStart"/>
+      <w:r>
+        <w:t>Main_Validation</w:t>
+      </w:r>
+      <w:proofErr w:type="spellEnd"/>
+      <w:r>
+        <w:t>\Vision Transformers\</w:t>
+      </w:r>
+      <w:proofErr w:type="spellStart"/>
+      <w:r>
+        <w:t>Results</w:t>
+      </w:r>
+      <w:proofErr w:type="spellEnd"/>
+      <w:r>
+        <w:t xml:space="preserve">\Experimento 1 - </w:t>
+      </w:r>
+      <w:proofErr w:type="spellStart"/>
+      <w:r>
+        <w:t>ViT</w:t>
+      </w:r>
+      <w:proofErr w:type="spellEnd"/>
+      <w:r>
+        <w:t>\Experimento 1 -</w:t>
+      </w:r>
+      <w:proofErr w:type="spellStart"/>
+      <w:r>
+        <w:t>ViT</w:t>
+      </w:r>
+      <w:proofErr w:type="spellEnd"/>
+      <w:r>
+        <w:t xml:space="preserve">- </w:t>
+      </w:r>
+      <w:proofErr w:type="spellStart"/>
+      <w:r>
+        <w:t>Sanity</w:t>
+      </w:r>
+      <w:proofErr w:type="spellEnd"/>
+      <w:r>
+        <w:t xml:space="preserve"> </w:t>
+      </w:r>
+      <w:proofErr w:type="spellStart"/>
+      <w:r>
+        <w:t>Check</w:t>
+      </w:r>
+      <w:proofErr w:type="spellEnd"/>
+      <w:r>
+        <w:t xml:space="preserve"> - LOG.txt"</w:t>
       </w:r>
       <w:r>
         <w:t xml:space="preserve">. </w:t>
@@ -1189,15 +1711,37 @@
         <w:lastRenderedPageBreak/>
         <w:t xml:space="preserve">Comportamento esperado para </w:t>
       </w:r>
-      <w:r>
-        <w:rPr>
-          <w:b/>
-          <w:bCs/>
-          <w:i/>
-          <w:iCs/>
-        </w:rPr>
-        <w:t>loss e accuracy</w:t>
-      </w:r>
+      <w:proofErr w:type="spellStart"/>
+      <w:r>
+        <w:rPr>
+          <w:b/>
+          <w:bCs/>
+          <w:i/>
+          <w:iCs/>
+        </w:rPr>
+        <w:t>loss</w:t>
+      </w:r>
+      <w:proofErr w:type="spellEnd"/>
+      <w:r>
+        <w:rPr>
+          <w:b/>
+          <w:bCs/>
+          <w:i/>
+          <w:iCs/>
+        </w:rPr>
+        <w:t xml:space="preserve"> e </w:t>
+      </w:r>
+      <w:proofErr w:type="spellStart"/>
+      <w:r>
+        <w:rPr>
+          <w:b/>
+          <w:bCs/>
+          <w:i/>
+          <w:iCs/>
+        </w:rPr>
+        <w:t>accuracy</w:t>
+      </w:r>
+      <w:proofErr w:type="spellEnd"/>
       <w:r>
         <w:rPr>
           <w:b/>
@@ -1365,13 +1909,37 @@
         <w:t xml:space="preserve"> </w:t>
       </w:r>
       <w:r>
-        <w:t>Rodar ViT-B/16 “fiel ao paper” em hardware comum é naturalmente lento.</w:t>
+        <w:t xml:space="preserve">Rodar </w:t>
+      </w:r>
+      <w:proofErr w:type="spellStart"/>
+      <w:r>
+        <w:t>ViT</w:t>
+      </w:r>
+      <w:proofErr w:type="spellEnd"/>
+      <w:r>
+        <w:t xml:space="preserve">-B/16 “fiel ao </w:t>
+      </w:r>
+      <w:proofErr w:type="spellStart"/>
+      <w:r>
+        <w:t>paper</w:t>
+      </w:r>
+      <w:proofErr w:type="spellEnd"/>
+      <w:r>
+        <w:t>” em hardware comum é naturalmente lento.</w:t>
       </w:r>
       <w:r>
         <w:t xml:space="preserve"> </w:t>
       </w:r>
       <w:r>
-        <w:t>O artigo foi feito em TPUs v3, com batch gigantesco. Dito isso, há otimizações seguras que não quebram a fidelidade científica para serem implementadas:</w:t>
+        <w:t xml:space="preserve">O artigo foi feito em </w:t>
+      </w:r>
+      <w:proofErr w:type="spellStart"/>
+      <w:r>
+        <w:t>TPUs</w:t>
+      </w:r>
+      <w:proofErr w:type="spellEnd"/>
+      <w:r>
+        <w:t xml:space="preserve"> v3, com batch gigantesco. Dito isso, há otimizações seguras que não quebram a fidelidade científica para serem implementadas:</w:t>
       </w:r>
     </w:p>
     <w:p>
@@ -1441,6 +2009,7 @@
       <w:r>
         <w:t xml:space="preserve">Utilização de </w:t>
       </w:r>
+      <w:proofErr w:type="spellStart"/>
       <w:r>
         <w:rPr>
           <w:i/>
@@ -1448,6 +2017,7 @@
         </w:rPr>
         <w:t>Mixed-precision</w:t>
       </w:r>
+      <w:proofErr w:type="spellEnd"/>
       <w:r>
         <w:t>, que consiste em</w:t>
       </w:r>
@@ -1521,7 +2091,31 @@
         <w:t xml:space="preserve"> </w:t>
       </w:r>
       <w:r>
-        <w:t>Como o batch é menor que o do artigo, o LR precisa ser menor. A sugestão é que base_lr = 3e-4 * (batch_size / 4096), o que melhora estabilidade sem trair o paper.</w:t>
+        <w:t xml:space="preserve">Como o batch é menor que o do artigo, o LR precisa ser menor. A sugestão é que </w:t>
+      </w:r>
+      <w:proofErr w:type="spellStart"/>
+      <w:r>
+        <w:t>base_lr</w:t>
+      </w:r>
+      <w:proofErr w:type="spellEnd"/>
+      <w:r>
+        <w:t xml:space="preserve"> = 3e-4 * (</w:t>
+      </w:r>
+      <w:proofErr w:type="spellStart"/>
+      <w:r>
+        <w:t>batch_size</w:t>
+      </w:r>
+      <w:proofErr w:type="spellEnd"/>
+      <w:r>
+        <w:t xml:space="preserve"> / 4096), o que melhora estabilidade sem trair o </w:t>
+      </w:r>
+      <w:proofErr w:type="spellStart"/>
+      <w:r>
+        <w:t>paper</w:t>
+      </w:r>
+      <w:proofErr w:type="spellEnd"/>
+      <w:r>
+        <w:t>.</w:t>
       </w:r>
     </w:p>
     <w:p>
@@ -1983,6 +2577,7 @@
       <w:r>
         <w:t xml:space="preserve">Utilização de </w:t>
       </w:r>
+      <w:proofErr w:type="spellStart"/>
       <w:r>
         <w:rPr>
           <w:i/>
@@ -2004,6 +2599,7 @@
         </w:rPr>
         <w:t>Precision</w:t>
       </w:r>
+      <w:proofErr w:type="spellEnd"/>
       <w:r>
         <w:t xml:space="preserve">, consiste em utilizar </w:t>
       </w:r>
@@ -2097,7 +2693,15 @@
         <w:t xml:space="preserve"> Menos memória: </w:t>
       </w:r>
       <w:r>
-        <w:t>números menores ocupam menos espaço, permitindo treinar modelos maiores ou usar batch sizes maiores.</w:t>
+        <w:t xml:space="preserve">números menores ocupam menos espaço, permitindo treinar modelos maiores ou usar batch </w:t>
+      </w:r>
+      <w:proofErr w:type="spellStart"/>
+      <w:r>
+        <w:t>sizes</w:t>
+      </w:r>
+      <w:proofErr w:type="spellEnd"/>
+      <w:r>
+        <w:t xml:space="preserve"> maiores.</w:t>
       </w:r>
     </w:p>
     <w:p>
@@ -2197,6 +2801,7 @@
       <w:r>
         <w:t>“</w:t>
       </w:r>
+      <w:proofErr w:type="spellStart"/>
       <w:r>
         <w:rPr>
           <w:i/>
@@ -2204,6 +2809,7 @@
         </w:rPr>
         <w:t>base_lr</w:t>
       </w:r>
+      <w:proofErr w:type="spellEnd"/>
       <w:r>
         <w:rPr>
           <w:i/>
@@ -2233,6 +2839,7 @@
       <w:r>
         <w:t>“</w:t>
       </w:r>
+      <w:proofErr w:type="spellStart"/>
       <w:r>
         <w:rPr>
           <w:i/>
@@ -2240,6 +2847,7 @@
         </w:rPr>
         <w:t>base_lr</w:t>
       </w:r>
+      <w:proofErr w:type="spellEnd"/>
       <w:r>
         <w:rPr>
           <w:i/>
@@ -2265,7 +2873,39 @@
         <w:t xml:space="preserve"> </w:t>
       </w:r>
       <w:r>
-        <w:t>dentro de um scheduler (warmup + cosine decay).</w:t>
+        <w:t xml:space="preserve">dentro de um </w:t>
+      </w:r>
+      <w:proofErr w:type="spellStart"/>
+      <w:r>
+        <w:t>scheduler</w:t>
+      </w:r>
+      <w:proofErr w:type="spellEnd"/>
+      <w:r>
+        <w:t xml:space="preserve"> (</w:t>
+      </w:r>
+      <w:proofErr w:type="spellStart"/>
+      <w:r>
+        <w:t>warmup</w:t>
+      </w:r>
+      <w:proofErr w:type="spellEnd"/>
+      <w:r>
+        <w:t xml:space="preserve"> + </w:t>
+      </w:r>
+      <w:proofErr w:type="spellStart"/>
+      <w:r>
+        <w:t>cosine</w:t>
+      </w:r>
+      <w:proofErr w:type="spellEnd"/>
+      <w:r>
+        <w:t xml:space="preserve"> </w:t>
+      </w:r>
+      <w:proofErr w:type="spellStart"/>
+      <w:r>
+        <w:t>decay</w:t>
+      </w:r>
+      <w:proofErr w:type="spellEnd"/>
+      <w:r>
+        <w:t>).</w:t>
       </w:r>
     </w:p>
     <w:p>
@@ -2319,6 +2959,7 @@
         </w:rPr>
         <w:t>-</w:t>
       </w:r>
+      <w:proofErr w:type="spellStart"/>
       <w:r>
         <w:rPr>
           <w:i/>
@@ -2326,6 +2967,7 @@
         </w:rPr>
         <w:t>tunning</w:t>
       </w:r>
+      <w:proofErr w:type="spellEnd"/>
       <w:r>
         <w:t xml:space="preserve">, o artigo não fixa um único LR universal, porque ele depende do </w:t>
       </w:r>
@@ -2334,8 +2976,17 @@
           <w:i/>
           <w:iCs/>
         </w:rPr>
-        <w:t>batch size</w:t>
-      </w:r>
+        <w:t xml:space="preserve">batch </w:t>
+      </w:r>
+      <w:proofErr w:type="spellStart"/>
+      <w:r>
+        <w:rPr>
+          <w:i/>
+          <w:iCs/>
+        </w:rPr>
+        <w:t>size</w:t>
+      </w:r>
+      <w:proofErr w:type="spellEnd"/>
       <w:r>
         <w:t xml:space="preserve">, </w:t>
       </w:r>
@@ -2351,6 +3002,7 @@
       <w:r>
         <w:t xml:space="preserve"> </w:t>
       </w:r>
+      <w:proofErr w:type="spellStart"/>
       <w:r>
         <w:rPr>
           <w:i/>
@@ -2358,6 +3010,7 @@
         </w:rPr>
         <w:t>backbone</w:t>
       </w:r>
+      <w:proofErr w:type="spellEnd"/>
       <w:r>
         <w:t>, d</w:t>
       </w:r>
@@ -2371,8 +3024,13 @@
         <w:t xml:space="preserve"> zer</w:t>
       </w:r>
       <w:r>
-        <w:t>ada da head</w:t>
-      </w:r>
+        <w:t xml:space="preserve">ada da </w:t>
+      </w:r>
+      <w:proofErr w:type="spellStart"/>
+      <w:r>
+        <w:t>head</w:t>
+      </w:r>
+      <w:proofErr w:type="spellEnd"/>
       <w:r>
         <w:t xml:space="preserve"> e da resolução da imagem</w:t>
       </w:r>
@@ -2386,7 +3044,15 @@
         <w:t xml:space="preserve">, </w:t>
       </w:r>
       <w:r>
-        <w:t>o que leva o gradiente a destruir as features pré-treinadas, com isso, o modelo entra em um regime parecido com treino do zero</w:t>
+        <w:t xml:space="preserve">o que leva o gradiente a destruir as features </w:t>
+      </w:r>
+      <w:proofErr w:type="spellStart"/>
+      <w:r>
+        <w:t>pré</w:t>
+      </w:r>
+      <w:proofErr w:type="spellEnd"/>
+      <w:r>
+        <w:t>-treinadas, com isso, o modelo entra em um regime parecido com treino do zero</w:t>
       </w:r>
       <w:r>
         <w:t>.</w:t>
@@ -2576,8 +3242,17 @@
           <w:sz w:val="18"/>
           <w:szCs w:val="18"/>
         </w:rPr>
-        <w:t>Explicação para o uso do Scheduler</w:t>
-      </w:r>
+        <w:t xml:space="preserve">Explicação para o uso do </w:t>
+      </w:r>
+      <w:proofErr w:type="spellStart"/>
+      <w:r>
+        <w:rPr>
+          <w:sz w:val="18"/>
+          <w:szCs w:val="18"/>
+        </w:rPr>
+        <w:t>Scheduler</w:t>
+      </w:r>
+      <w:proofErr w:type="spellEnd"/>
     </w:p>
     <w:p>
       <w:pPr>
@@ -2786,7 +3461,23 @@
           <w:bCs/>
         </w:rPr>
         <w:lastRenderedPageBreak/>
-        <w:t>Configuração do treinamento (Fine-Tunning):</w:t>
+        <w:t>Configuração do treinamento (Fine-</w:t>
+      </w:r>
+      <w:proofErr w:type="spellStart"/>
+      <w:r>
+        <w:rPr>
+          <w:b/>
+          <w:bCs/>
+        </w:rPr>
+        <w:t>Tunning</w:t>
+      </w:r>
+      <w:proofErr w:type="spellEnd"/>
+      <w:r>
+        <w:rPr>
+          <w:b/>
+          <w:bCs/>
+        </w:rPr>
+        <w:t>):</w:t>
       </w:r>
       <w:r>
         <w:rPr>
@@ -2973,7 +3664,103 @@
           <w:i/>
           <w:iCs/>
         </w:rPr>
-        <w:t>"\Projeto-Classificadores\Main_Validation\Vision Transformers\Results\Experimento 2 - ViT\Experimento 2 -ViT- Sanity Check - LOG.txt"</w:t>
+        <w:t>"\Projeto-Classificadores\</w:t>
+      </w:r>
+      <w:proofErr w:type="spellStart"/>
+      <w:r>
+        <w:rPr>
+          <w:i/>
+          <w:iCs/>
+        </w:rPr>
+        <w:t>Main_Validation</w:t>
+      </w:r>
+      <w:proofErr w:type="spellEnd"/>
+      <w:r>
+        <w:rPr>
+          <w:i/>
+          <w:iCs/>
+        </w:rPr>
+        <w:t>\Vision Transformers\</w:t>
+      </w:r>
+      <w:proofErr w:type="spellStart"/>
+      <w:r>
+        <w:rPr>
+          <w:i/>
+          <w:iCs/>
+        </w:rPr>
+        <w:t>Results</w:t>
+      </w:r>
+      <w:proofErr w:type="spellEnd"/>
+      <w:r>
+        <w:rPr>
+          <w:i/>
+          <w:iCs/>
+        </w:rPr>
+        <w:t xml:space="preserve">\Experimento 2 - </w:t>
+      </w:r>
+      <w:proofErr w:type="spellStart"/>
+      <w:r>
+        <w:rPr>
+          <w:i/>
+          <w:iCs/>
+        </w:rPr>
+        <w:t>ViT</w:t>
+      </w:r>
+      <w:proofErr w:type="spellEnd"/>
+      <w:r>
+        <w:rPr>
+          <w:i/>
+          <w:iCs/>
+        </w:rPr>
+        <w:t>\Experimento 2 -</w:t>
+      </w:r>
+      <w:proofErr w:type="spellStart"/>
+      <w:r>
+        <w:rPr>
+          <w:i/>
+          <w:iCs/>
+        </w:rPr>
+        <w:t>ViT</w:t>
+      </w:r>
+      <w:proofErr w:type="spellEnd"/>
+      <w:r>
+        <w:rPr>
+          <w:i/>
+          <w:iCs/>
+        </w:rPr>
+        <w:t xml:space="preserve">- </w:t>
+      </w:r>
+      <w:proofErr w:type="spellStart"/>
+      <w:r>
+        <w:rPr>
+          <w:i/>
+          <w:iCs/>
+        </w:rPr>
+        <w:t>Sanity</w:t>
+      </w:r>
+      <w:proofErr w:type="spellEnd"/>
+      <w:r>
+        <w:rPr>
+          <w:i/>
+          <w:iCs/>
+        </w:rPr>
+        <w:t xml:space="preserve"> </w:t>
+      </w:r>
+      <w:proofErr w:type="spellStart"/>
+      <w:r>
+        <w:rPr>
+          <w:i/>
+          <w:iCs/>
+        </w:rPr>
+        <w:t>Check</w:t>
+      </w:r>
+      <w:proofErr w:type="spellEnd"/>
+      <w:r>
+        <w:rPr>
+          <w:i/>
+          <w:iCs/>
+        </w:rPr>
+        <w:t xml:space="preserve"> - LOG.txt"</w:t>
       </w:r>
     </w:p>
     <w:p>
@@ -3013,14 +3800,31 @@
         <w:t>O início do treinamento apresenta</w:t>
       </w:r>
       <w:r>
-        <w:t xml:space="preserve"> loss ≈ 6.90, que é exatamente o valor esperado para </w:t>
-      </w:r>
-      <w:r>
-        <w:rPr>
-          <w:i/>
-          <w:iCs/>
-        </w:rPr>
-        <w:t>cross-entropy com 1000</w:t>
+        <w:t xml:space="preserve"> </w:t>
+      </w:r>
+      <w:proofErr w:type="spellStart"/>
+      <w:r>
+        <w:t>loss</w:t>
+      </w:r>
+      <w:proofErr w:type="spellEnd"/>
+      <w:r>
+        <w:t xml:space="preserve"> ≈ 6.90, que é exatamente o valor esperado para </w:t>
+      </w:r>
+      <w:proofErr w:type="spellStart"/>
+      <w:r>
+        <w:rPr>
+          <w:i/>
+          <w:iCs/>
+        </w:rPr>
+        <w:t>cross-entropy</w:t>
+      </w:r>
+      <w:proofErr w:type="spellEnd"/>
+      <w:r>
+        <w:rPr>
+          <w:i/>
+          <w:iCs/>
+        </w:rPr>
+        <w:t xml:space="preserve"> com 1000</w:t>
       </w:r>
       <w:r>
         <w:t>. A</w:t>
@@ -3044,12 +3848,21 @@
       <w:r>
         <w:t xml:space="preserve">curva </w:t>
       </w:r>
-      <w:r>
-        <w:rPr>
-          <w:b/>
-          <w:bCs/>
-        </w:rPr>
-        <w:t>monotonicamente decrescente</w:t>
+      <w:proofErr w:type="spellStart"/>
+      <w:r>
+        <w:rPr>
+          <w:b/>
+          <w:bCs/>
+        </w:rPr>
+        <w:t>monotonicamente</w:t>
+      </w:r>
+      <w:proofErr w:type="spellEnd"/>
+      <w:r>
+        <w:rPr>
+          <w:b/>
+          <w:bCs/>
+        </w:rPr>
+        <w:t xml:space="preserve"> decrescente</w:t>
       </w:r>
       <w:r>
         <w:t>, sem explosão</w:t>
@@ -3220,6 +4033,7 @@
       <w:r>
         <w:t xml:space="preserve">A acurácia de treino oscila entre 50% e 90% em batches pequenos. Isso é esperado, uma vez que este valor NÃO representa a acurácia global, mas sim a acurácia por batch. </w:t>
       </w:r>
+      <w:proofErr w:type="spellStart"/>
       <w:r>
         <w:rPr>
           <w:i/>
@@ -3227,9 +4041,11 @@
         </w:rPr>
         <w:t>Accuracy</w:t>
       </w:r>
+      <w:proofErr w:type="spellEnd"/>
       <w:r>
         <w:t xml:space="preserve"> de batch em </w:t>
       </w:r>
+      <w:proofErr w:type="spellStart"/>
       <w:r>
         <w:rPr>
           <w:i/>
@@ -3237,6 +4053,7 @@
         </w:rPr>
         <w:t>ImageNet</w:t>
       </w:r>
+      <w:proofErr w:type="spellEnd"/>
       <w:r>
         <w:t xml:space="preserve"> já é extremamente ruidosa e um batch pequeno piora ainda mais este resultado.</w:t>
       </w:r>
@@ -3686,8 +4503,17 @@
       </w:pPr>
       <w:r>
         <w:lastRenderedPageBreak/>
-        <w:t xml:space="preserve">Os experimentos voltados para a validação da arquitetura ViT utilizaram os </w:t>
-      </w:r>
+        <w:t xml:space="preserve">Os experimentos voltados para a validação da arquitetura </w:t>
+      </w:r>
+      <w:proofErr w:type="spellStart"/>
+      <w:r>
+        <w:t>ViT</w:t>
+      </w:r>
+      <w:proofErr w:type="spellEnd"/>
+      <w:r>
+        <w:t xml:space="preserve"> utilizaram os </w:t>
+      </w:r>
+      <w:proofErr w:type="spellStart"/>
       <w:r>
         <w:rPr>
           <w:i/>
@@ -3695,9 +4521,11 @@
         </w:rPr>
         <w:t>TFRecords</w:t>
       </w:r>
+      <w:proofErr w:type="spellEnd"/>
       <w:r>
         <w:t xml:space="preserve"> da </w:t>
       </w:r>
+      <w:proofErr w:type="spellStart"/>
       <w:r>
         <w:rPr>
           <w:i/>
@@ -3705,9 +4533,11 @@
         </w:rPr>
         <w:t>ImageNet</w:t>
       </w:r>
+      <w:proofErr w:type="spellEnd"/>
       <w:r>
         <w:t xml:space="preserve"> como entrada. O </w:t>
       </w:r>
+      <w:proofErr w:type="spellStart"/>
       <w:r>
         <w:rPr>
           <w:i/>
@@ -3715,8 +4545,17 @@
         </w:rPr>
         <w:t>TFRecord</w:t>
       </w:r>
-      <w:r>
-        <w:t xml:space="preserve"> é um formato binário de armazenamento de dados criado pelo TensorFlow para</w:t>
+      <w:proofErr w:type="spellEnd"/>
+      <w:r>
+        <w:t xml:space="preserve"> é um formato binário de armazenamento de dados criado pelo </w:t>
+      </w:r>
+      <w:proofErr w:type="spellStart"/>
+      <w:r>
+        <w:t>TensorFlow</w:t>
+      </w:r>
+      <w:proofErr w:type="spellEnd"/>
+      <w:r>
+        <w:t xml:space="preserve"> para</w:t>
       </w:r>
       <w:r>
         <w:t xml:space="preserve"> a leitura de</w:t>
@@ -3770,7 +4609,15 @@
         <w:t xml:space="preserve"> </w:t>
       </w:r>
       <w:r>
-        <w:t xml:space="preserve">Um TFRecord é basicamente uma lista de exemplos serializados, onde cada exemplo contém </w:t>
+        <w:t xml:space="preserve">Um </w:t>
+      </w:r>
+      <w:proofErr w:type="spellStart"/>
+      <w:r>
+        <w:t>TFRecord</w:t>
+      </w:r>
+      <w:proofErr w:type="spellEnd"/>
+      <w:r>
+        <w:t xml:space="preserve"> é basicamente uma lista de exemplos serializados, onde cada exemplo contém </w:t>
       </w:r>
       <w:r>
         <w:rPr>
@@ -3836,8 +4683,17 @@
           <w:sz w:val="18"/>
           <w:szCs w:val="18"/>
         </w:rPr>
-        <w:t>Exemplo da estrutura de um TFRecord</w:t>
-      </w:r>
+        <w:t xml:space="preserve">Exemplo da estrutura de um </w:t>
+      </w:r>
+      <w:proofErr w:type="spellStart"/>
+      <w:r>
+        <w:rPr>
+          <w:sz w:val="18"/>
+          <w:szCs w:val="18"/>
+        </w:rPr>
+        <w:t>TFRecord</w:t>
+      </w:r>
+      <w:proofErr w:type="spellEnd"/>
     </w:p>
     <w:p>
       <w:pPr>
@@ -3909,12 +4765,21 @@
       <w:r>
         <w:t xml:space="preserve"> </w:t>
       </w:r>
-      <w:r>
-        <w:rPr>
-          <w:i/>
-          <w:iCs/>
-        </w:rPr>
-        <w:t>Protocol Buffers</w:t>
+      <w:proofErr w:type="spellStart"/>
+      <w:r>
+        <w:rPr>
+          <w:i/>
+          <w:iCs/>
+        </w:rPr>
+        <w:t>Protocol</w:t>
+      </w:r>
+      <w:proofErr w:type="spellEnd"/>
+      <w:r>
+        <w:rPr>
+          <w:i/>
+          <w:iCs/>
+        </w:rPr>
+        <w:t xml:space="preserve"> Buffers</w:t>
       </w:r>
       <w:r>
         <w:rPr>
@@ -3930,6 +4795,7 @@
         </w:rPr>
         <w:t>(</w:t>
       </w:r>
+      <w:proofErr w:type="spellStart"/>
       <w:r>
         <w:rPr>
           <w:i/>
@@ -3937,6 +4803,7 @@
         </w:rPr>
         <w:t>Protobuf</w:t>
       </w:r>
+      <w:proofErr w:type="spellEnd"/>
       <w:r>
         <w:t>)</w:t>
       </w:r>
@@ -3944,7 +4811,15 @@
         <w:t xml:space="preserve"> é um formato de serialização de dados criado pelo Google</w:t>
       </w:r>
       <w:r>
-        <w:t xml:space="preserve"> e utilizado na criação dos TFRecords que busca </w:t>
+        <w:t xml:space="preserve"> e utilizado na criação dos </w:t>
+      </w:r>
+      <w:proofErr w:type="spellStart"/>
+      <w:r>
+        <w:t>TFRecords</w:t>
+      </w:r>
+      <w:proofErr w:type="spellEnd"/>
+      <w:r>
+        <w:t xml:space="preserve"> que busca </w:t>
       </w:r>
       <w:r>
         <w:t>transformar estruturas de dados (listas, dicionários, tensores, objetos) em bytes binários</w:t>
@@ -4009,7 +4884,23 @@
           <w:b/>
           <w:bCs/>
         </w:rPr>
-        <w:t>“image”:&lt;bytes&gt;,</w:t>
+        <w:t>“</w:t>
+      </w:r>
+      <w:proofErr w:type="spellStart"/>
+      <w:r>
+        <w:rPr>
+          <w:b/>
+          <w:bCs/>
+        </w:rPr>
+        <w:t>image</w:t>
+      </w:r>
+      <w:proofErr w:type="spellEnd"/>
+      <w:r>
+        <w:rPr>
+          <w:b/>
+          <w:bCs/>
+        </w:rPr>
+        <w:t>”:&lt;bytes&gt;,</w:t>
       </w:r>
     </w:p>
     <w:p>
@@ -4027,7 +4918,23 @@
           <w:b/>
           <w:bCs/>
         </w:rPr>
-        <w:t>“label” : 281,</w:t>
+        <w:t>“</w:t>
+      </w:r>
+      <w:proofErr w:type="spellStart"/>
+      <w:r>
+        <w:rPr>
+          <w:b/>
+          <w:bCs/>
+        </w:rPr>
+        <w:t>label</w:t>
+      </w:r>
+      <w:proofErr w:type="spellEnd"/>
+      <w:r>
+        <w:rPr>
+          <w:b/>
+          <w:bCs/>
+        </w:rPr>
+        <w:t>” : 281,</w:t>
       </w:r>
     </w:p>
     <w:p>
@@ -4045,7 +4952,23 @@
           <w:b/>
           <w:bCs/>
         </w:rPr>
-        <w:t>“height” : 224,</w:t>
+        <w:t>“</w:t>
+      </w:r>
+      <w:proofErr w:type="spellStart"/>
+      <w:r>
+        <w:rPr>
+          <w:b/>
+          <w:bCs/>
+        </w:rPr>
+        <w:t>height</w:t>
+      </w:r>
+      <w:proofErr w:type="spellEnd"/>
+      <w:r>
+        <w:rPr>
+          <w:b/>
+          <w:bCs/>
+        </w:rPr>
+        <w:t>” : 224,</w:t>
       </w:r>
     </w:p>
     <w:p>
@@ -4063,7 +4986,23 @@
           <w:b/>
           <w:bCs/>
         </w:rPr>
-        <w:t>“width” : 224</w:t>
+        <w:t>“</w:t>
+      </w:r>
+      <w:proofErr w:type="spellStart"/>
+      <w:r>
+        <w:rPr>
+          <w:b/>
+          <w:bCs/>
+        </w:rPr>
+        <w:t>width</w:t>
+      </w:r>
+      <w:proofErr w:type="spellEnd"/>
+      <w:r>
+        <w:rPr>
+          <w:b/>
+          <w:bCs/>
+        </w:rPr>
+        <w:t>” : 224</w:t>
       </w:r>
     </w:p>
     <w:p>
@@ -4185,7 +5124,23 @@
           <w:sz w:val="18"/>
           <w:szCs w:val="18"/>
         </w:rPr>
-        <w:t>: Exemplificação da utilização do ProtoBuf.</w:t>
+        <w:t xml:space="preserve">: Exemplificação da utilização do </w:t>
+      </w:r>
+      <w:proofErr w:type="spellStart"/>
+      <w:r>
+        <w:rPr>
+          <w:sz w:val="18"/>
+          <w:szCs w:val="18"/>
+        </w:rPr>
+        <w:t>ProtoBuf</w:t>
+      </w:r>
+      <w:proofErr w:type="spellEnd"/>
+      <w:r>
+        <w:rPr>
+          <w:sz w:val="18"/>
+          <w:szCs w:val="18"/>
+        </w:rPr>
+        <w:t>.</w:t>
       </w:r>
     </w:p>
     <w:p>
@@ -4311,10 +5266,26 @@
         <w:t xml:space="preserve"> estimada</w:t>
       </w:r>
       <w:r>
-        <w:t xml:space="preserve"> entre o tamanho e complexidade da base de dados com a conversão prévia para TFRecords.</w:t>
-      </w:r>
-      <w:r>
-        <w:t xml:space="preserve"> De modo geral, a conversão para TFRecords se mostra apenas vantajoso para casos onde a base de dados é extensa, ou quando houver treinamento distribuído.</w:t>
+        <w:t xml:space="preserve"> entre o tamanho e complexidade da base de dados com a conversão prévia para </w:t>
+      </w:r>
+      <w:proofErr w:type="spellStart"/>
+      <w:r>
+        <w:t>TFRecords</w:t>
+      </w:r>
+      <w:proofErr w:type="spellEnd"/>
+      <w:r>
+        <w:t>.</w:t>
+      </w:r>
+      <w:r>
+        <w:t xml:space="preserve"> De modo geral, a conversão para </w:t>
+      </w:r>
+      <w:proofErr w:type="spellStart"/>
+      <w:r>
+        <w:t>TFRecords</w:t>
+      </w:r>
+      <w:proofErr w:type="spellEnd"/>
+      <w:r>
+        <w:t xml:space="preserve"> se mostra apenas vantajoso para casos onde a base de dados é extensa, ou quando houver treinamento distribuído.</w:t>
       </w:r>
     </w:p>
     <w:p>
@@ -4356,7 +5327,39 @@
           <w:sz w:val="18"/>
           <w:szCs w:val="18"/>
         </w:rPr>
-        <w:t xml:space="preserve">Relação entre o tamanho/complexidade de um dataset com o uso do TFRecords </w:t>
+        <w:t xml:space="preserve">Relação entre o tamanho/complexidade de um </w:t>
+      </w:r>
+      <w:proofErr w:type="spellStart"/>
+      <w:r>
+        <w:rPr>
+          <w:sz w:val="18"/>
+          <w:szCs w:val="18"/>
+        </w:rPr>
+        <w:t>dataset</w:t>
+      </w:r>
+      <w:proofErr w:type="spellEnd"/>
+      <w:r>
+        <w:rPr>
+          <w:sz w:val="18"/>
+          <w:szCs w:val="18"/>
+        </w:rPr>
+        <w:t xml:space="preserve"> com o uso do </w:t>
+      </w:r>
+      <w:proofErr w:type="spellStart"/>
+      <w:r>
+        <w:rPr>
+          <w:sz w:val="18"/>
+          <w:szCs w:val="18"/>
+        </w:rPr>
+        <w:t>TFRecords</w:t>
+      </w:r>
+      <w:proofErr w:type="spellEnd"/>
+      <w:r>
+        <w:rPr>
+          <w:sz w:val="18"/>
+          <w:szCs w:val="18"/>
+        </w:rPr>
+        <w:t xml:space="preserve"> </w:t>
       </w:r>
     </w:p>
     <w:p>
@@ -4423,7 +5426,23 @@
         <w:jc w:val="both"/>
       </w:pPr>
       <w:r>
-        <w:t xml:space="preserve">Utilizar diretamente as imagens PNG é a abordagem mais simples e comum para datasets pequenos e médios. Nesse caso, o TensorFlow faz a leitura dos arquivos individuais, decodifica o PNG, aplica os pré-processamentos necessários e envia </w:t>
+        <w:t xml:space="preserve">Utilizar diretamente as imagens PNG é a abordagem mais simples e comum para </w:t>
+      </w:r>
+      <w:proofErr w:type="spellStart"/>
+      <w:r>
+        <w:t>datasets</w:t>
+      </w:r>
+      <w:proofErr w:type="spellEnd"/>
+      <w:r>
+        <w:t xml:space="preserve"> pequenos e médios. Nesse caso, o </w:t>
+      </w:r>
+      <w:proofErr w:type="spellStart"/>
+      <w:r>
+        <w:t>TensorFlow</w:t>
+      </w:r>
+      <w:proofErr w:type="spellEnd"/>
+      <w:r>
+        <w:t xml:space="preserve"> faz a leitura dos arquivos individuais, decodifica o PNG, aplica os pré-processamentos necessários e envia </w:t>
       </w:r>
       <w:r>
         <w:lastRenderedPageBreak/>
@@ -4434,7 +5453,23 @@
           <w:b/>
           <w:bCs/>
         </w:rPr>
-        <w:t>Para um dataset com 13.000 imagens, esse pipeline é mais do que suficiente.</w:t>
+        <w:t xml:space="preserve">Para um </w:t>
+      </w:r>
+      <w:proofErr w:type="spellStart"/>
+      <w:r>
+        <w:rPr>
+          <w:b/>
+          <w:bCs/>
+        </w:rPr>
+        <w:t>dataset</w:t>
+      </w:r>
+      <w:proofErr w:type="spellEnd"/>
+      <w:r>
+        <w:rPr>
+          <w:b/>
+          <w:bCs/>
+        </w:rPr>
+        <w:t xml:space="preserve"> com 13.000 imagens, esse pipeline é mais do que suficiente.</w:t>
       </w:r>
     </w:p>
     <w:p>
@@ -4469,6 +5504,7 @@
       <w:r>
         <w:t xml:space="preserve">A principal desvantagem dessa opção é a baixa escalabilidade. Caso o </w:t>
       </w:r>
+      <w:proofErr w:type="spellStart"/>
       <w:r>
         <w:rPr>
           <w:i/>
@@ -4476,6 +5512,7 @@
         </w:rPr>
         <w:t>dataset</w:t>
       </w:r>
+      <w:proofErr w:type="spellEnd"/>
       <w:r>
         <w:t xml:space="preserve"> cresça </w:t>
       </w:r>
@@ -4511,6 +5548,7 @@
       <w:r>
         <w:t xml:space="preserve">É importante destacar que </w:t>
       </w:r>
+      <w:proofErr w:type="spellStart"/>
       <w:r>
         <w:rPr>
           <w:i/>
@@ -4518,9 +5556,11 @@
         </w:rPr>
         <w:t>TFRecords</w:t>
       </w:r>
+      <w:proofErr w:type="spellEnd"/>
       <w:r>
         <w:t xml:space="preserve"> não alteram a qualidade do treinamento. Eles não melhoram </w:t>
       </w:r>
+      <w:proofErr w:type="spellStart"/>
       <w:r>
         <w:rPr>
           <w:i/>
@@ -4528,9 +5568,11 @@
         </w:rPr>
         <w:t>accuracy</w:t>
       </w:r>
+      <w:proofErr w:type="spellEnd"/>
       <w:r>
         <w:t xml:space="preserve">, </w:t>
       </w:r>
+      <w:proofErr w:type="spellStart"/>
       <w:r>
         <w:rPr>
           <w:i/>
@@ -4538,6 +5580,7 @@
         </w:rPr>
         <w:t>loss</w:t>
       </w:r>
+      <w:proofErr w:type="spellEnd"/>
       <w:r>
         <w:t xml:space="preserve"> ou capacidade de generalização do modelo. O conteúdo do dado é exatamente o mesmo; o que muda é apenas a forma como ele é carregado.</w:t>
       </w:r>
@@ -4549,7 +5592,23 @@
           <w:b/>
           <w:bCs/>
         </w:rPr>
-        <w:t>Como conclusão, a base de dados dos camundongos para este projeto NÃO será convertida em TFRecords para o treinamento.</w:t>
+        <w:t xml:space="preserve">Como conclusão, a base de dados dos camundongos para este projeto NÃO será convertida em </w:t>
+      </w:r>
+      <w:proofErr w:type="spellStart"/>
+      <w:r>
+        <w:rPr>
+          <w:b/>
+          <w:bCs/>
+        </w:rPr>
+        <w:t>TFRecords</w:t>
+      </w:r>
+      <w:proofErr w:type="spellEnd"/>
+      <w:r>
+        <w:rPr>
+          <w:b/>
+          <w:bCs/>
+        </w:rPr>
+        <w:t xml:space="preserve"> para o treinamento.</w:t>
       </w:r>
     </w:p>
     <w:p>
@@ -4832,7 +5891,15 @@
         <w:jc w:val="both"/>
       </w:pPr>
       <w:r>
-        <w:t>Definição de Steps e Epochs:</w:t>
+        <w:t xml:space="preserve">Definição de Steps e </w:t>
+      </w:r>
+      <w:proofErr w:type="spellStart"/>
+      <w:r>
+        <w:t>Epochs</w:t>
+      </w:r>
+      <w:proofErr w:type="spellEnd"/>
+      <w:r>
+        <w:t>:</w:t>
       </w:r>
     </w:p>
     <w:p>
@@ -4876,11 +5943,24 @@
       <w:r>
         <w:t xml:space="preserve">1 </w:t>
       </w:r>
+      <w:proofErr w:type="spellStart"/>
       <w:r>
         <w:t>E</w:t>
       </w:r>
       <w:r>
-        <w:t>poch = “passar” pelo dataset inteiro uma vez</w:t>
+        <w:t>poch</w:t>
+      </w:r>
+      <w:proofErr w:type="spellEnd"/>
+      <w:r>
+        <w:t xml:space="preserve"> = “passar” pelo </w:t>
+      </w:r>
+      <w:proofErr w:type="spellStart"/>
+      <w:r>
+        <w:t>dataset</w:t>
+      </w:r>
+      <w:proofErr w:type="spellEnd"/>
+      <w:r>
+        <w:t xml:space="preserve"> inteiro uma vez</w:t>
       </w:r>
       <w:r>
         <w:t>.</w:t>
@@ -5083,7 +6163,39 @@
           <w:b/>
           <w:bCs/>
         </w:rPr>
-        <w:t>Fase 1 — Sanity Check (obrigatória)</w:t>
+        <w:t xml:space="preserve">Fase 1 — </w:t>
+      </w:r>
+      <w:proofErr w:type="spellStart"/>
+      <w:r>
+        <w:rPr>
+          <w:b/>
+          <w:bCs/>
+        </w:rPr>
+        <w:t>Sanity</w:t>
+      </w:r>
+      <w:proofErr w:type="spellEnd"/>
+      <w:r>
+        <w:rPr>
+          <w:b/>
+          <w:bCs/>
+        </w:rPr>
+        <w:t xml:space="preserve"> </w:t>
+      </w:r>
+      <w:proofErr w:type="spellStart"/>
+      <w:r>
+        <w:rPr>
+          <w:b/>
+          <w:bCs/>
+        </w:rPr>
+        <w:t>Check</w:t>
+      </w:r>
+      <w:proofErr w:type="spellEnd"/>
+      <w:r>
+        <w:rPr>
+          <w:b/>
+          <w:bCs/>
+        </w:rPr>
+        <w:t xml:space="preserve"> (obrigatória)</w:t>
       </w:r>
       <w:r>
         <w:rPr>
@@ -5201,13 +6313,45 @@
           <w:b/>
           <w:bCs/>
         </w:rPr>
-        <w:t xml:space="preserve"> Exploração de hiperparâmetros: </w:t>
+        <w:t xml:space="preserve"> Exploração de </w:t>
+      </w:r>
+      <w:proofErr w:type="spellStart"/>
+      <w:r>
+        <w:rPr>
+          <w:b/>
+          <w:bCs/>
+        </w:rPr>
+        <w:t>hiperparâmetros</w:t>
+      </w:r>
+      <w:proofErr w:type="spellEnd"/>
+      <w:r>
+        <w:rPr>
+          <w:b/>
+          <w:bCs/>
+        </w:rPr>
+        <w:t xml:space="preserve">: </w:t>
       </w:r>
       <w:r>
         <w:t>S</w:t>
       </w:r>
       <w:r>
-        <w:t xml:space="preserve">erve para avaliar overfitting e definir valores de Learning Rate e Batch Size. A ideia é observar o comportamento do treinamento, avaliar curvas, otimizar a arquitetura e salvar o melhor checkpoint. </w:t>
+        <w:t xml:space="preserve">erve para avaliar </w:t>
+      </w:r>
+      <w:proofErr w:type="spellStart"/>
+      <w:r>
+        <w:t>overfitting</w:t>
+      </w:r>
+      <w:proofErr w:type="spellEnd"/>
+      <w:r>
+        <w:t xml:space="preserve"> e definir valores de Learning Rate e Batch </w:t>
+      </w:r>
+      <w:proofErr w:type="spellStart"/>
+      <w:r>
+        <w:t>Size</w:t>
+      </w:r>
+      <w:proofErr w:type="spellEnd"/>
+      <w:r>
+        <w:t xml:space="preserve">. A ideia é observar o comportamento do treinamento, avaliar curvas, otimizar a arquitetura e salvar o melhor checkpoint. </w:t>
       </w:r>
     </w:p>
     <w:p>
@@ -5327,7 +6471,15 @@
         <w:t xml:space="preserve">: </w:t>
       </w:r>
       <w:r>
-        <w:t>Tem o objetivo de obter a melhor generalização possível para o modelo, possibilitando a coleta de um resultado verdadeiramente científico. Para datasets menores (como o caso deste projeto</w:t>
+        <w:t xml:space="preserve">Tem o objetivo de obter a melhor generalização possível para o modelo, possibilitando a coleta de um resultado verdadeiramente científico. Para </w:t>
+      </w:r>
+      <w:proofErr w:type="spellStart"/>
+      <w:r>
+        <w:t>datasets</w:t>
+      </w:r>
+      <w:proofErr w:type="spellEnd"/>
+      <w:r>
+        <w:t xml:space="preserve"> menores (como o caso deste projeto</w:t>
       </w:r>
       <w:r>
         <w:t>), o</w:t>
@@ -5670,7 +6822,35 @@
         <w:rPr>
           <w:color w:val="000000" w:themeColor="text1"/>
         </w:rPr>
-        <w:t xml:space="preserve"> sanity check serve para verificar</w:t>
+        <w:t xml:space="preserve"> </w:t>
+      </w:r>
+      <w:proofErr w:type="spellStart"/>
+      <w:r>
+        <w:rPr>
+          <w:color w:val="000000" w:themeColor="text1"/>
+        </w:rPr>
+        <w:t>sanity</w:t>
+      </w:r>
+      <w:proofErr w:type="spellEnd"/>
+      <w:r>
+        <w:rPr>
+          <w:color w:val="000000" w:themeColor="text1"/>
+        </w:rPr>
+        <w:t xml:space="preserve"> </w:t>
+      </w:r>
+      <w:proofErr w:type="spellStart"/>
+      <w:r>
+        <w:rPr>
+          <w:color w:val="000000" w:themeColor="text1"/>
+        </w:rPr>
+        <w:t>check</w:t>
+      </w:r>
+      <w:proofErr w:type="spellEnd"/>
+      <w:r>
+        <w:rPr>
+          <w:color w:val="000000" w:themeColor="text1"/>
+        </w:rPr>
+        <w:t xml:space="preserve"> serve para verificar</w:t>
       </w:r>
       <w:r>
         <w:rPr>
@@ -5885,7 +7065,21 @@
         <w:rPr>
           <w:color w:val="000000" w:themeColor="text1"/>
         </w:rPr>
-        <w:t xml:space="preserve"> pipeline de dados, labels e gradientes está correto</w:t>
+        <w:t xml:space="preserve"> pipeline de dados, </w:t>
+      </w:r>
+      <w:proofErr w:type="spellStart"/>
+      <w:r>
+        <w:rPr>
+          <w:color w:val="000000" w:themeColor="text1"/>
+        </w:rPr>
+        <w:t>labels</w:t>
+      </w:r>
+      <w:proofErr w:type="spellEnd"/>
+      <w:r>
+        <w:rPr>
+          <w:color w:val="000000" w:themeColor="text1"/>
+        </w:rPr>
+        <w:t xml:space="preserve"> e gradientes está correto</w:t>
       </w:r>
       <w:r>
         <w:rPr>
@@ -5906,8 +7100,21 @@
       <w:r>
         <w:t xml:space="preserve"> </w:t>
       </w:r>
-      <w:r>
-        <w:t>Sanity Check Básico</w:t>
+      <w:proofErr w:type="spellStart"/>
+      <w:r>
+        <w:t>Sanity</w:t>
+      </w:r>
+      <w:proofErr w:type="spellEnd"/>
+      <w:r>
+        <w:t xml:space="preserve"> </w:t>
+      </w:r>
+      <w:proofErr w:type="spellStart"/>
+      <w:r>
+        <w:t>Check</w:t>
+      </w:r>
+      <w:proofErr w:type="spellEnd"/>
+      <w:r>
+        <w:t xml:space="preserve"> Básico</w:t>
       </w:r>
       <w:r>
         <w:t xml:space="preserve"> com </w:t>
@@ -5929,7 +7136,15 @@
         <w:t>→</w:t>
       </w:r>
       <w:r>
-        <w:t xml:space="preserve"> Rede pré-treinada com a base ImageNet21K</w:t>
+        <w:t xml:space="preserve"> Rede </w:t>
+      </w:r>
+      <w:proofErr w:type="spellStart"/>
+      <w:r>
+        <w:t>pré</w:t>
+      </w:r>
+      <w:proofErr w:type="spellEnd"/>
+      <w:r>
+        <w:t>-treinada com a base ImageNet21K</w:t>
       </w:r>
     </w:p>
     <w:p>
@@ -5942,8 +7157,21 @@
         <w:t>→</w:t>
       </w:r>
       <w:r>
-        <w:t xml:space="preserve"> Arquitetura ViT em conformidade com a implementação Google Research</w:t>
-      </w:r>
+        <w:t xml:space="preserve"> Arquitetura </w:t>
+      </w:r>
+      <w:proofErr w:type="spellStart"/>
+      <w:r>
+        <w:t>ViT</w:t>
+      </w:r>
+      <w:proofErr w:type="spellEnd"/>
+      <w:r>
+        <w:t xml:space="preserve"> em conformidade com a implementação Google </w:t>
+      </w:r>
+      <w:proofErr w:type="spellStart"/>
+      <w:r>
+        <w:t>Research</w:t>
+      </w:r>
+      <w:proofErr w:type="spellEnd"/>
     </w:p>
     <w:p>
       <w:pPr>
@@ -6148,8 +7376,18 @@
           <w:iCs/>
           <w:color w:val="000000" w:themeColor="text1"/>
         </w:rPr>
-        <w:t>Logs do Pycharm</w:t>
-      </w:r>
+        <w:t xml:space="preserve">Logs do </w:t>
+      </w:r>
+      <w:proofErr w:type="spellStart"/>
+      <w:r>
+        <w:rPr>
+          <w:i/>
+          <w:iCs/>
+          <w:color w:val="000000" w:themeColor="text1"/>
+        </w:rPr>
+        <w:t>Pycharm</w:t>
+      </w:r>
+      <w:proofErr w:type="spellEnd"/>
       <w:r>
         <w:rPr>
           <w:i/>
@@ -6178,7 +7416,79 @@
           <w:iCs/>
           <w:color w:val="000000" w:themeColor="text1"/>
         </w:rPr>
-        <w:t>"\Projeto-Classificadores\Main_Project\VisionTransformers\Results\Experimento 3 - ViT\Experimento 3 -ViT- Sanity Check - LOG.txt"</w:t>
+        <w:t xml:space="preserve">"\Projeto-Classificadores\Main_Project\VisionTransformers\Results\Experimento 3 - </w:t>
+      </w:r>
+      <w:proofErr w:type="spellStart"/>
+      <w:r>
+        <w:rPr>
+          <w:i/>
+          <w:iCs/>
+          <w:color w:val="000000" w:themeColor="text1"/>
+        </w:rPr>
+        <w:t>ViT</w:t>
+      </w:r>
+      <w:proofErr w:type="spellEnd"/>
+      <w:r>
+        <w:rPr>
+          <w:i/>
+          <w:iCs/>
+          <w:color w:val="000000" w:themeColor="text1"/>
+        </w:rPr>
+        <w:t>\Experimento 3 -</w:t>
+      </w:r>
+      <w:proofErr w:type="spellStart"/>
+      <w:r>
+        <w:rPr>
+          <w:i/>
+          <w:iCs/>
+          <w:color w:val="000000" w:themeColor="text1"/>
+        </w:rPr>
+        <w:t>ViT</w:t>
+      </w:r>
+      <w:proofErr w:type="spellEnd"/>
+      <w:r>
+        <w:rPr>
+          <w:i/>
+          <w:iCs/>
+          <w:color w:val="000000" w:themeColor="text1"/>
+        </w:rPr>
+        <w:t xml:space="preserve">- </w:t>
+      </w:r>
+      <w:proofErr w:type="spellStart"/>
+      <w:r>
+        <w:rPr>
+          <w:i/>
+          <w:iCs/>
+          <w:color w:val="000000" w:themeColor="text1"/>
+        </w:rPr>
+        <w:t>Sanity</w:t>
+      </w:r>
+      <w:proofErr w:type="spellEnd"/>
+      <w:r>
+        <w:rPr>
+          <w:i/>
+          <w:iCs/>
+          <w:color w:val="000000" w:themeColor="text1"/>
+        </w:rPr>
+        <w:t xml:space="preserve"> </w:t>
+      </w:r>
+      <w:proofErr w:type="spellStart"/>
+      <w:r>
+        <w:rPr>
+          <w:i/>
+          <w:iCs/>
+          <w:color w:val="000000" w:themeColor="text1"/>
+        </w:rPr>
+        <w:t>Check</w:t>
+      </w:r>
+      <w:proofErr w:type="spellEnd"/>
+      <w:r>
+        <w:rPr>
+          <w:i/>
+          <w:iCs/>
+          <w:color w:val="000000" w:themeColor="text1"/>
+        </w:rPr>
+        <w:t xml:space="preserve"> - LOG.txt"</w:t>
       </w:r>
     </w:p>
     <w:p>
@@ -6231,11 +7541,19 @@
         </w:rPr>
         <w:t>(</w:t>
       </w:r>
-      <w:r>
-        <w:rPr>
-          <w:color w:val="000000" w:themeColor="text1"/>
-        </w:rPr>
-        <w:t>loss=1.0986</w:t>
+      <w:proofErr w:type="spellStart"/>
+      <w:r>
+        <w:rPr>
+          <w:color w:val="000000" w:themeColor="text1"/>
+        </w:rPr>
+        <w:t>loss</w:t>
+      </w:r>
+      <w:proofErr w:type="spellEnd"/>
+      <w:r>
+        <w:rPr>
+          <w:color w:val="000000" w:themeColor="text1"/>
+        </w:rPr>
+        <w:t>=1.0986</w:t>
       </w:r>
       <w:r>
         <w:rPr>
@@ -6274,7 +7592,21 @@
         <w:rPr>
           <w:color w:val="000000" w:themeColor="text1"/>
         </w:rPr>
-        <w:t xml:space="preserve">Para uma amostra, a cross-entropy (utilizada neste modelo) é calculada </w:t>
+        <w:t xml:space="preserve">Para uma amostra, a </w:t>
+      </w:r>
+      <w:proofErr w:type="spellStart"/>
+      <w:r>
+        <w:rPr>
+          <w:color w:val="000000" w:themeColor="text1"/>
+        </w:rPr>
+        <w:t>cross-entropy</w:t>
+      </w:r>
+      <w:proofErr w:type="spellEnd"/>
+      <w:r>
+        <w:rPr>
+          <w:color w:val="000000" w:themeColor="text1"/>
+        </w:rPr>
+        <w:t xml:space="preserve"> (utilizada neste modelo) é calculada </w:t>
       </w:r>
       <m:oMath>
         <m:r>
@@ -6299,6 +7631,7 @@
         </w:rPr>
         <w:t>‘</w:t>
       </w:r>
+      <w:proofErr w:type="spellStart"/>
       <w:r>
         <w:rPr>
           <w:rFonts w:eastAsiaTheme="minorEastAsia"/>
@@ -6308,6 +7641,7 @@
         </w:rPr>
         <w:t>py</w:t>
       </w:r>
+      <w:proofErr w:type="spellEnd"/>
       <w:r>
         <w:rPr>
           <w:rFonts w:eastAsiaTheme="minorEastAsia"/>
@@ -6476,7 +7810,21 @@
         <w:rPr>
           <w:color w:val="000000" w:themeColor="text1"/>
         </w:rPr>
-        <w:t>Usando log natural (ln), que é o padrão em ML</w:t>
+        <w:t>Usando log natural (</w:t>
+      </w:r>
+      <w:proofErr w:type="spellStart"/>
+      <w:r>
+        <w:rPr>
+          <w:color w:val="000000" w:themeColor="text1"/>
+        </w:rPr>
+        <w:t>ln</w:t>
+      </w:r>
+      <w:proofErr w:type="spellEnd"/>
+      <w:r>
+        <w:rPr>
+          <w:color w:val="000000" w:themeColor="text1"/>
+        </w:rPr>
+        <w:t>), que é o padrão em ML</w:t>
       </w:r>
       <w:r>
         <w:rPr>
@@ -6914,8 +8262,20 @@
           <w:iCs/>
           <w:color w:val="000000" w:themeColor="text1"/>
         </w:rPr>
-        <w:t xml:space="preserve"> accuracy</w:t>
-      </w:r>
+        <w:t xml:space="preserve"> </w:t>
+      </w:r>
+      <w:proofErr w:type="spellStart"/>
+      <w:r>
+        <w:rPr>
+          <w:b/>
+          <w:bCs/>
+          <w:i/>
+          <w:iCs/>
+          <w:color w:val="000000" w:themeColor="text1"/>
+        </w:rPr>
+        <w:t>accuracy</w:t>
+      </w:r>
+      <w:proofErr w:type="spellEnd"/>
       <w:r>
         <w:rPr>
           <w:color w:val="000000" w:themeColor="text1"/>
@@ -6985,8 +8345,20 @@
           <w:iCs/>
           <w:color w:val="000000" w:themeColor="text1"/>
         </w:rPr>
-        <w:t>Top-1 accuracy</w:t>
-      </w:r>
+        <w:t xml:space="preserve">Top-1 </w:t>
+      </w:r>
+      <w:proofErr w:type="spellStart"/>
+      <w:r>
+        <w:rPr>
+          <w:b/>
+          <w:bCs/>
+          <w:i/>
+          <w:iCs/>
+          <w:color w:val="000000" w:themeColor="text1"/>
+        </w:rPr>
+        <w:t>accuracy</w:t>
+      </w:r>
+      <w:proofErr w:type="spellEnd"/>
       <w:r>
         <w:rPr>
           <w:color w:val="000000" w:themeColor="text1"/>
@@ -7039,6 +8411,7 @@
         </w:rPr>
         <w:t xml:space="preserve"> </w:t>
       </w:r>
+      <w:proofErr w:type="spellStart"/>
       <w:r>
         <w:rPr>
           <w:i/>
@@ -7047,12 +8420,14 @@
         </w:rPr>
         <w:t>Val_Loss</w:t>
       </w:r>
+      <w:proofErr w:type="spellEnd"/>
       <w:r>
         <w:rPr>
           <w:color w:val="000000" w:themeColor="text1"/>
         </w:rPr>
         <w:t xml:space="preserve"> tem um valor próximo da </w:t>
       </w:r>
+      <w:proofErr w:type="spellStart"/>
       <w:r>
         <w:rPr>
           <w:i/>
@@ -7061,12 +8436,14 @@
         </w:rPr>
         <w:t>Train_loss</w:t>
       </w:r>
+      <w:proofErr w:type="spellEnd"/>
       <w:r>
         <w:rPr>
           <w:color w:val="000000" w:themeColor="text1"/>
         </w:rPr>
         <w:t xml:space="preserve">, o que indica que não há um </w:t>
       </w:r>
+      <w:proofErr w:type="spellStart"/>
       <w:r>
         <w:rPr>
           <w:i/>
@@ -7075,6 +8452,7 @@
         </w:rPr>
         <w:t>overfitting</w:t>
       </w:r>
+      <w:proofErr w:type="spellEnd"/>
       <w:r>
         <w:rPr>
           <w:color w:val="000000" w:themeColor="text1"/>
@@ -7250,7 +8628,21 @@
         <w:rPr>
           <w:color w:val="000000" w:themeColor="text1"/>
         </w:rPr>
-        <w:t xml:space="preserve"> funcional. Agora, as próximas etapas devem focar na correção de erros (Retirada total da métrica Top-5, que foi apenas um remanescente utilizado pela implementação original pela equipe do Google), e na condução de novos treinamentos voltados para a definição dos hiperparâmetros ideais.</w:t>
+        <w:t xml:space="preserve"> funcional. Agora, as próximas etapas devem focar na correção de erros (Retirada total da métrica Top-5, que foi apenas um remanescente utilizado pela implementação original pela equipe do Google), e na condução de novos treinamentos voltados para a definição dos </w:t>
+      </w:r>
+      <w:proofErr w:type="spellStart"/>
+      <w:r>
+        <w:rPr>
+          <w:color w:val="000000" w:themeColor="text1"/>
+        </w:rPr>
+        <w:t>hiperparâmetros</w:t>
+      </w:r>
+      <w:proofErr w:type="spellEnd"/>
+      <w:r>
+        <w:rPr>
+          <w:color w:val="000000" w:themeColor="text1"/>
+        </w:rPr>
+        <w:t xml:space="preserve"> ideais.</w:t>
       </w:r>
     </w:p>
     <w:p>
@@ -7440,6 +8832,7 @@
       <w:r>
         <w:t xml:space="preserve">Conforme observado no Experimento II, conduzido com a arquitetura ResNet-50, a acurácia de validação próxima de zero sugere um possível desalinhamento entre os rótulos e as predições no conjunto de validação. Embora esse problema não tenha sido discutido na conclusão do experimento anterior (Experimento III – </w:t>
       </w:r>
+      <w:proofErr w:type="spellStart"/>
       <w:r>
         <w:rPr>
           <w:i/>
@@ -7447,9 +8840,11 @@
         </w:rPr>
         <w:t>ViT</w:t>
       </w:r>
+      <w:proofErr w:type="spellEnd"/>
       <w:r>
         <w:t xml:space="preserve">), em razão do uso da métrica top-1 em vez da acurácia, recomenda-se a aplicação, da mesma abordagem adotada na correção do Experimento II com a arquitetura </w:t>
       </w:r>
+      <w:proofErr w:type="spellStart"/>
       <w:r>
         <w:rPr>
           <w:i/>
@@ -7457,6 +8852,7 @@
         </w:rPr>
         <w:t>ResNet</w:t>
       </w:r>
+      <w:proofErr w:type="spellEnd"/>
       <w:r>
         <w:t>.</w:t>
       </w:r>
@@ -7502,6 +8898,7 @@
         <w:lastRenderedPageBreak/>
         <w:t xml:space="preserve">a do arquivo </w:t>
       </w:r>
+      <w:proofErr w:type="spellStart"/>
       <w:r>
         <w:rPr>
           <w:i/>
@@ -7509,6 +8906,7 @@
         </w:rPr>
         <w:t>DataLoader</w:t>
       </w:r>
+      <w:proofErr w:type="spellEnd"/>
       <w:r>
         <w:t xml:space="preserve"> específico da arquitetura. Agora, a estrutura esperada segue conforme ilustrado pela figura 18.</w:t>
       </w:r>
@@ -7707,43 +9105,117 @@
           <w:iCs/>
           <w:color w:val="000000" w:themeColor="text1"/>
         </w:rPr>
-        <w:t>Logs do Pycharm estão localizados em</w:t>
-      </w:r>
-      <w:r>
-        <w:rPr>
-          <w:i/>
-          <w:iCs/>
-          <w:color w:val="000000" w:themeColor="text1"/>
+        <w:t xml:space="preserve">Logs do </w:t>
+      </w:r>
+      <w:proofErr w:type="spellStart"/>
+      <w:r>
+        <w:rPr>
+          <w:i/>
+          <w:iCs/>
+          <w:color w:val="000000" w:themeColor="text1"/>
+        </w:rPr>
+        <w:t>Pycharm</w:t>
+      </w:r>
+      <w:proofErr w:type="spellEnd"/>
+      <w:r>
+        <w:rPr>
+          <w:i/>
+          <w:iCs/>
+          <w:color w:val="000000" w:themeColor="text1"/>
+        </w:rPr>
+        <w:t xml:space="preserve"> estão localizados em </w:t>
+      </w:r>
+      <w:r>
+        <w:rPr>
+          <w:i/>
+          <w:iCs/>
+        </w:rPr>
+        <w:t xml:space="preserve">"\Projeto-Classificadores\Main_Project\VisionTransformers\Results\Experimento 4 - </w:t>
+      </w:r>
+      <w:proofErr w:type="spellStart"/>
+      <w:r>
+        <w:rPr>
+          <w:i/>
+          <w:iCs/>
+        </w:rPr>
+        <w:t>ViT</w:t>
+      </w:r>
+      <w:proofErr w:type="spellEnd"/>
+      <w:r>
+        <w:rPr>
+          <w:i/>
+          <w:iCs/>
+        </w:rPr>
+        <w:t xml:space="preserve"> (</w:t>
+      </w:r>
+      <w:r>
+        <w:rPr>
+          <w:i/>
+          <w:iCs/>
+        </w:rPr>
+        <w:t>Correção</w:t>
+      </w:r>
+      <w:r>
+        <w:rPr>
+          <w:i/>
+          <w:iCs/>
+        </w:rPr>
+        <w:t xml:space="preserve"> 1</w:t>
+      </w:r>
+      <w:r>
+        <w:rPr>
+          <w:i/>
+          <w:iCs/>
+        </w:rPr>
+        <w:t>)\Experimento 4 -</w:t>
+      </w:r>
+      <w:proofErr w:type="spellStart"/>
+      <w:r>
+        <w:rPr>
+          <w:i/>
+          <w:iCs/>
+        </w:rPr>
+        <w:t>ViT</w:t>
+      </w:r>
+      <w:proofErr w:type="spellEnd"/>
+      <w:r>
+        <w:rPr>
+          <w:i/>
+          <w:iCs/>
+        </w:rPr>
+        <w:t xml:space="preserve">- </w:t>
+      </w:r>
+      <w:proofErr w:type="spellStart"/>
+      <w:r>
+        <w:rPr>
+          <w:i/>
+          <w:iCs/>
+        </w:rPr>
+        <w:t>Sanity</w:t>
+      </w:r>
+      <w:proofErr w:type="spellEnd"/>
+      <w:r>
+        <w:rPr>
+          <w:i/>
+          <w:iCs/>
         </w:rPr>
         <w:t xml:space="preserve"> </w:t>
       </w:r>
-      <w:r>
-        <w:rPr>
-          <w:i/>
-          <w:iCs/>
-        </w:rPr>
-        <w:t>"\Projeto-Classificadores\Main_Project\VisionTransformers\Results\Experimento 4 - ViT (</w:t>
-      </w:r>
-      <w:r>
-        <w:rPr>
-          <w:i/>
-          <w:iCs/>
-        </w:rPr>
-        <w:t>Correção</w:t>
-      </w:r>
-      <w:r>
-        <w:rPr>
-          <w:i/>
-          <w:iCs/>
-        </w:rPr>
-        <w:t xml:space="preserve"> 1</w:t>
-      </w:r>
-      <w:r>
-        <w:rPr>
-          <w:i/>
-          <w:iCs/>
-        </w:rPr>
-        <w:t>)\Experimento 4 -ViT- Sanity Check - LOG.txt"</w:t>
+      <w:proofErr w:type="spellStart"/>
+      <w:r>
+        <w:rPr>
+          <w:i/>
+          <w:iCs/>
+        </w:rPr>
+        <w:t>Check</w:t>
+      </w:r>
+      <w:proofErr w:type="spellEnd"/>
+      <w:r>
+        <w:rPr>
+          <w:i/>
+          <w:iCs/>
+        </w:rPr>
+        <w:t xml:space="preserve"> - LOG.txt"</w:t>
       </w:r>
     </w:p>
     <w:p>
@@ -7765,6 +9237,7 @@
       <w:r>
         <w:t xml:space="preserve">No início do treinamento, a </w:t>
       </w:r>
+      <w:proofErr w:type="spellStart"/>
       <w:r>
         <w:rPr>
           <w:i/>
@@ -7772,6 +9245,7 @@
         </w:rPr>
         <w:t>loss</w:t>
       </w:r>
+      <w:proofErr w:type="spellEnd"/>
       <w:r>
         <w:t xml:space="preserve"> em torno de 1.0986 é um sinal positivo</w:t>
       </w:r>
@@ -7786,14 +9260,7 @@
           <w:i/>
           <w:iCs/>
         </w:rPr>
-        <w:t>log (</w:t>
-      </w:r>
-      <w:r>
-        <w:rPr>
-          <w:i/>
-          <w:iCs/>
-        </w:rPr>
-        <w:t>3)</w:t>
+        <w:t>log (3)</w:t>
       </w:r>
       <w:r>
         <w:t>, que é a entropia cruzada esperada quando o modelo faz previsões praticamente uniformes para três classes.</w:t>
@@ -7823,27 +9290,20 @@
           <w:sz w:val="18"/>
           <w:szCs w:val="18"/>
         </w:rPr>
-        <w:t xml:space="preserve"> 1</w:t>
+        <w:t xml:space="preserve"> 19</w:t>
       </w:r>
       <w:r>
         <w:rPr>
           <w:sz w:val="18"/>
           <w:szCs w:val="18"/>
         </w:rPr>
-        <w:t>9</w:t>
+        <w:t xml:space="preserve">: </w:t>
       </w:r>
       <w:r>
         <w:rPr>
           <w:sz w:val="18"/>
           <w:szCs w:val="18"/>
         </w:rPr>
-        <w:t xml:space="preserve">: </w:t>
-      </w:r>
-      <w:r>
-        <w:rPr>
-          <w:sz w:val="18"/>
-          <w:szCs w:val="18"/>
-        </w:rPr>
         <w:t>Valores iniciais de treinamento</w:t>
       </w:r>
     </w:p>
@@ -7854,6 +9314,9 @@
         <w:jc w:val="center"/>
       </w:pPr>
       <w:r>
+        <w:rPr>
+          <w:noProof/>
+        </w:rPr>
         <w:drawing>
           <wp:inline distT="0" distB="0" distL="0" distR="0" wp14:anchorId="65E45F37" wp14:editId="52BF0FA2">
             <wp:extent cx="2823211" cy="1385752"/>
@@ -7909,15 +9372,32 @@
         <w:jc w:val="both"/>
       </w:pPr>
       <w:r>
-        <w:t xml:space="preserve">Ao longo das épocas, observa-se uma queda gradual da loss de treino, passando de aproximadamente 1.08 para 1.00. Essa tendência descendente indica que o modelo está aprendendo, ainda que lentamente, o que é esperado em um </w:t>
-      </w:r>
-      <w:r>
-        <w:rPr>
-          <w:i/>
-          <w:iCs/>
-        </w:rPr>
-        <w:t>fine-tuning</w:t>
-      </w:r>
+        <w:t xml:space="preserve">Ao longo das épocas, observa-se uma queda gradual da </w:t>
+      </w:r>
+      <w:proofErr w:type="spellStart"/>
+      <w:r>
+        <w:t>loss</w:t>
+      </w:r>
+      <w:proofErr w:type="spellEnd"/>
+      <w:r>
+        <w:t xml:space="preserve"> de treino, passando de aproximadamente 1.08 para 1.00. Essa tendência descendente indica que o modelo está aprendendo, ainda que lentamente, o que é esperado em um </w:t>
+      </w:r>
+      <w:r>
+        <w:rPr>
+          <w:i/>
+          <w:iCs/>
+        </w:rPr>
+        <w:t>fine-</w:t>
+      </w:r>
+      <w:proofErr w:type="spellStart"/>
+      <w:r>
+        <w:rPr>
+          <w:i/>
+          <w:iCs/>
+        </w:rPr>
+        <w:t>tuning</w:t>
+      </w:r>
+      <w:proofErr w:type="spellEnd"/>
       <w:r>
         <w:t xml:space="preserve"> curto, com poucas épocas e um número limitado de steps por época.</w:t>
       </w:r>
@@ -7961,27 +9441,20 @@
           <w:sz w:val="18"/>
           <w:szCs w:val="18"/>
         </w:rPr>
-        <w:t xml:space="preserve"> </w:t>
+        <w:t xml:space="preserve"> 20</w:t>
       </w:r>
       <w:r>
         <w:rPr>
           <w:sz w:val="18"/>
           <w:szCs w:val="18"/>
         </w:rPr>
-        <w:t>20</w:t>
+        <w:t xml:space="preserve">: </w:t>
       </w:r>
       <w:r>
         <w:rPr>
           <w:sz w:val="18"/>
           <w:szCs w:val="18"/>
         </w:rPr>
-        <w:t xml:space="preserve">: </w:t>
-      </w:r>
-      <w:r>
-        <w:rPr>
-          <w:sz w:val="18"/>
-          <w:szCs w:val="18"/>
-        </w:rPr>
         <w:t>Métricas retornadas por época</w:t>
       </w:r>
     </w:p>
@@ -7992,6 +9465,9 @@
         <w:jc w:val="center"/>
       </w:pPr>
       <w:r>
+        <w:rPr>
+          <w:noProof/>
+        </w:rPr>
         <w:drawing>
           <wp:inline distT="0" distB="0" distL="0" distR="0" wp14:anchorId="427DAE3E" wp14:editId="485A2160">
             <wp:extent cx="3621549" cy="1031443"/>
@@ -8048,16 +9524,35 @@
       <w:r>
         <w:t xml:space="preserve">A acurácia de treino, por sua vez, permanece relativamente estável, oscilando em torno de 44% a 46%. Esse comportamento é coerente com o contexto do </w:t>
       </w:r>
-      <w:r>
-        <w:rPr>
-          <w:i/>
-          <w:iCs/>
-        </w:rPr>
-        <w:t>sanity check</w:t>
-      </w:r>
+      <w:proofErr w:type="spellStart"/>
+      <w:r>
+        <w:rPr>
+          <w:i/>
+          <w:iCs/>
+        </w:rPr>
+        <w:t>sanity</w:t>
+      </w:r>
+      <w:proofErr w:type="spellEnd"/>
+      <w:r>
+        <w:rPr>
+          <w:i/>
+          <w:iCs/>
+        </w:rPr>
+        <w:t xml:space="preserve"> </w:t>
+      </w:r>
+      <w:proofErr w:type="spellStart"/>
+      <w:r>
+        <w:rPr>
+          <w:i/>
+          <w:iCs/>
+        </w:rPr>
+        <w:t>check</w:t>
+      </w:r>
+      <w:proofErr w:type="spellEnd"/>
       <w:r>
         <w:t xml:space="preserve">: poucas épocas, apenas 100 steps por época e uso de </w:t>
       </w:r>
+      <w:proofErr w:type="spellStart"/>
       <w:r>
         <w:rPr>
           <w:i/>
@@ -8065,6 +9560,7 @@
         </w:rPr>
         <w:t>augmentations</w:t>
       </w:r>
+      <w:proofErr w:type="spellEnd"/>
       <w:r>
         <w:t xml:space="preserve"> relativamente fortes.</w:t>
       </w:r>
@@ -8207,27 +9703,20 @@
           <w:sz w:val="18"/>
           <w:szCs w:val="18"/>
         </w:rPr>
-        <w:t xml:space="preserve"> 2</w:t>
+        <w:t xml:space="preserve"> 21</w:t>
       </w:r>
       <w:r>
         <w:rPr>
           <w:sz w:val="18"/>
           <w:szCs w:val="18"/>
         </w:rPr>
-        <w:t>1</w:t>
+        <w:t xml:space="preserve">: </w:t>
       </w:r>
       <w:r>
         <w:rPr>
           <w:sz w:val="18"/>
           <w:szCs w:val="18"/>
         </w:rPr>
-        <w:t xml:space="preserve">: </w:t>
-      </w:r>
-      <w:r>
-        <w:rPr>
-          <w:sz w:val="18"/>
-          <w:szCs w:val="18"/>
-        </w:rPr>
         <w:t>Correções aplicadas</w:t>
       </w:r>
     </w:p>
@@ -8245,6 +9734,7 @@
         <w:rPr>
           <w:b/>
           <w:bCs/>
+          <w:noProof/>
         </w:rPr>
         <w:drawing>
           <wp:inline distT="0" distB="0" distL="0" distR="0" wp14:anchorId="0B42918B" wp14:editId="6B4BE849">
@@ -8297,6 +9787,7 @@
       <w:pPr>
         <w:pStyle w:val="PargrafodaLista"/>
         <w:ind w:left="1416"/>
+        <w:jc w:val="both"/>
       </w:pPr>
       <w:r>
         <w:t xml:space="preserve">O resultado de validação de um novo teste de sanidade (Seguindo a mesma estrutura do experimento IV) </w:t>
@@ -8304,6 +9795,253 @@
       <w:r>
         <w:t>é demonstrado a seguir pela figura 22.</w:t>
       </w:r>
+      <w:r>
+        <w:t xml:space="preserve"> Após as correções, o resultado se mantém semelhante</w:t>
+      </w:r>
+      <w:r>
+        <w:t xml:space="preserve">, o que pode ser atribuído ao uso de fortes técnicas de data </w:t>
+      </w:r>
+      <w:proofErr w:type="spellStart"/>
+      <w:r>
+        <w:t>augmentation</w:t>
+      </w:r>
+      <w:proofErr w:type="spellEnd"/>
+      <w:r>
+        <w:t xml:space="preserve"> no treinamento aliadas ao fine-</w:t>
+      </w:r>
+      <w:proofErr w:type="spellStart"/>
+      <w:r>
+        <w:t>tuning</w:t>
+      </w:r>
+      <w:proofErr w:type="spellEnd"/>
+      <w:r>
+        <w:t xml:space="preserve"> de pesos </w:t>
+      </w:r>
+      <w:proofErr w:type="spellStart"/>
+      <w:r>
+        <w:t>pré</w:t>
+      </w:r>
+      <w:proofErr w:type="spellEnd"/>
+      <w:r>
+        <w:t xml:space="preserve">-treinados no </w:t>
+      </w:r>
+      <w:proofErr w:type="spellStart"/>
+      <w:r>
+        <w:t>ImageNet</w:t>
+      </w:r>
+      <w:proofErr w:type="spellEnd"/>
+      <w:r>
+        <w:t>, favorecendo a capacidade de generalização do modelo.</w:t>
+      </w:r>
+      <w:r>
+        <w:t xml:space="preserve"> Como conclusão, pelas limitações impostas pelo teste de sanidade, optou-se por continuar os experimentos e avaliar os comportamentos futuros.</w:t>
+      </w:r>
+    </w:p>
+    <w:p>
+      <w:pPr>
+        <w:pStyle w:val="PargrafodaLista"/>
+        <w:ind w:left="1416"/>
+        <w:jc w:val="both"/>
+      </w:pPr>
+    </w:p>
+    <w:p>
+      <w:pPr>
+        <w:jc w:val="both"/>
+      </w:pPr>
+    </w:p>
+    <w:p>
+      <w:pPr>
+        <w:jc w:val="both"/>
+      </w:pPr>
+    </w:p>
+    <w:p>
+      <w:pPr>
+        <w:pStyle w:val="PargrafodaLista"/>
+        <w:ind w:left="1416"/>
+        <w:jc w:val="both"/>
+      </w:pPr>
+    </w:p>
+    <w:p>
+      <w:pPr>
+        <w:pStyle w:val="PargrafodaLista"/>
+        <w:ind w:left="1440"/>
+        <w:jc w:val="center"/>
+      </w:pPr>
+      <w:r>
+        <w:rPr>
+          <w:sz w:val="18"/>
+          <w:szCs w:val="18"/>
+        </w:rPr>
+        <w:lastRenderedPageBreak/>
+        <w:t>Figura</w:t>
+      </w:r>
+      <w:r>
+        <w:rPr>
+          <w:sz w:val="18"/>
+          <w:szCs w:val="18"/>
+        </w:rPr>
+        <w:t xml:space="preserve"> 2</w:t>
+      </w:r>
+      <w:r>
+        <w:rPr>
+          <w:sz w:val="18"/>
+          <w:szCs w:val="18"/>
+        </w:rPr>
+        <w:t>2</w:t>
+      </w:r>
+      <w:r>
+        <w:rPr>
+          <w:sz w:val="18"/>
+          <w:szCs w:val="18"/>
+        </w:rPr>
+        <w:t xml:space="preserve">: </w:t>
+      </w:r>
+      <w:r>
+        <w:rPr>
+          <w:sz w:val="18"/>
+          <w:szCs w:val="18"/>
+        </w:rPr>
+        <w:t>Resultados obtidos após as correções citadas</w:t>
+      </w:r>
+    </w:p>
+    <w:p>
+      <w:pPr>
+        <w:pStyle w:val="PargrafodaLista"/>
+        <w:ind w:left="1416"/>
+        <w:jc w:val="center"/>
+      </w:pPr>
+      <w:r>
+        <w:drawing>
+          <wp:inline distT="0" distB="0" distL="0" distR="0" wp14:anchorId="12E4AB38" wp14:editId="0F2D7E6E">
+            <wp:extent cx="2787893" cy="1875400"/>
+            <wp:effectExtent l="0" t="0" r="0" b="0"/>
+            <wp:docPr id="1227882979" name="Imagem 1"/>
+            <wp:cNvGraphicFramePr>
+              <a:graphicFrameLocks xmlns:a="http://schemas.openxmlformats.org/drawingml/2006/main" noChangeAspect="1"/>
+            </wp:cNvGraphicFramePr>
+            <a:graphic xmlns:a="http://schemas.openxmlformats.org/drawingml/2006/main">
+              <a:graphicData uri="http://schemas.openxmlformats.org/drawingml/2006/picture">
+                <pic:pic xmlns:pic="http://schemas.openxmlformats.org/drawingml/2006/picture">
+                  <pic:nvPicPr>
+                    <pic:cNvPr id="1227882979" name=""/>
+                    <pic:cNvPicPr/>
+                  </pic:nvPicPr>
+                  <pic:blipFill>
+                    <a:blip r:embed="rId37"/>
+                    <a:stretch>
+                      <a:fillRect/>
+                    </a:stretch>
+                  </pic:blipFill>
+                  <pic:spPr>
+                    <a:xfrm>
+                      <a:off x="0" y="0"/>
+                      <a:ext cx="2794931" cy="1880135"/>
+                    </a:xfrm>
+                    <a:prstGeom prst="rect">
+                      <a:avLst/>
+                    </a:prstGeom>
+                  </pic:spPr>
+                </pic:pic>
+              </a:graphicData>
+            </a:graphic>
+          </wp:inline>
+        </w:drawing>
+      </w:r>
+    </w:p>
+    <w:p>
+      <w:pPr>
+        <w:jc w:val="both"/>
+        <w:rPr>
+          <w:b/>
+          <w:bCs/>
+        </w:rPr>
+      </w:pPr>
+      <w:r>
+        <w:rPr>
+          <w:noProof/>
+        </w:rPr>
+        <mc:AlternateContent>
+          <mc:Choice Requires="wps">
+            <w:drawing>
+              <wp:anchor distT="0" distB="0" distL="114300" distR="114300" simplePos="0" relativeHeight="251671552" behindDoc="0" locked="0" layoutInCell="1" allowOverlap="1" wp14:anchorId="08571F8C" wp14:editId="74A0E0D7">
+                <wp:simplePos x="0" y="0"/>
+                <wp:positionH relativeFrom="margin">
+                  <wp:align>center</wp:align>
+                </wp:positionH>
+                <wp:positionV relativeFrom="paragraph">
+                  <wp:posOffset>268166</wp:posOffset>
+                </wp:positionV>
+                <wp:extent cx="7020000" cy="0"/>
+                <wp:effectExtent l="0" t="0" r="0" b="0"/>
+                <wp:wrapNone/>
+                <wp:docPr id="1845464214" name="Conector reto 1"/>
+                <wp:cNvGraphicFramePr/>
+                <a:graphic xmlns:a="http://schemas.openxmlformats.org/drawingml/2006/main">
+                  <a:graphicData uri="http://schemas.microsoft.com/office/word/2010/wordprocessingShape">
+                    <wps:wsp>
+                      <wps:cNvCnPr/>
+                      <wps:spPr>
+                        <a:xfrm flipV="1">
+                          <a:off x="0" y="0"/>
+                          <a:ext cx="7020000" cy="0"/>
+                        </a:xfrm>
+                        <a:prstGeom prst="line">
+                          <a:avLst/>
+                        </a:prstGeom>
+                        <a:ln w="12700">
+                          <a:solidFill>
+                            <a:schemeClr val="tx1"/>
+                          </a:solidFill>
+                          <a:prstDash val="solid"/>
+                        </a:ln>
+                      </wps:spPr>
+                      <wps:style>
+                        <a:lnRef idx="1">
+                          <a:schemeClr val="accent1"/>
+                        </a:lnRef>
+                        <a:fillRef idx="0">
+                          <a:schemeClr val="accent1"/>
+                        </a:fillRef>
+                        <a:effectRef idx="0">
+                          <a:schemeClr val="accent1"/>
+                        </a:effectRef>
+                        <a:fontRef idx="minor">
+                          <a:schemeClr val="tx1"/>
+                        </a:fontRef>
+                      </wps:style>
+                      <wps:bodyPr/>
+                    </wps:wsp>
+                  </a:graphicData>
+                </a:graphic>
+                <wp14:sizeRelH relativeFrom="margin">
+                  <wp14:pctWidth>0</wp14:pctWidth>
+                </wp14:sizeRelH>
+                <wp14:sizeRelV relativeFrom="margin">
+                  <wp14:pctHeight>0</wp14:pctHeight>
+                </wp14:sizeRelV>
+              </wp:anchor>
+            </w:drawing>
+          </mc:Choice>
+          <mc:Fallback>
+            <w:pict>
+              <v:line w14:anchorId="6C5D5EB3" id="Conector reto 1" o:spid="_x0000_s1026" style="position:absolute;flip:y;z-index:251671552;visibility:visible;mso-wrap-style:square;mso-width-percent:0;mso-height-percent:0;mso-wrap-distance-left:9pt;mso-wrap-distance-top:0;mso-wrap-distance-right:9pt;mso-wrap-distance-bottom:0;mso-position-horizontal:center;mso-position-horizontal-relative:margin;mso-position-vertical:absolute;mso-position-vertical-relative:text;mso-width-percent:0;mso-height-percent:0;mso-width-relative:margin;mso-height-relative:margin" from="0,21.1pt" to="552.75pt,21.1pt" o:gfxdata="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" strokecolor="black [3213]" strokeweight="1pt">
+                <v:stroke joinstyle="miter"/>
+                <w10:wrap anchorx="margin"/>
+              </v:line>
+            </w:pict>
+          </mc:Fallback>
+        </mc:AlternateContent>
+      </w:r>
+    </w:p>
+    <w:p>
+      <w:pPr>
+        <w:pStyle w:val="PargrafodaLista"/>
+        <w:jc w:val="both"/>
+        <w:rPr>
+          <w:b/>
+          <w:bCs/>
+        </w:rPr>
+      </w:pPr>
     </w:p>
     <w:p>
       <w:pPr>
@@ -8386,17 +10124,6 @@
         </w:rPr>
         <w:t>:</w:t>
       </w:r>
-    </w:p>
-    <w:p>
-      <w:pPr>
-        <w:pStyle w:val="PargrafodaLista"/>
-        <w:ind w:left="1440"/>
-        <w:jc w:val="both"/>
-        <w:rPr>
-          <w:b/>
-          <w:bCs/>
-        </w:rPr>
-      </w:pPr>
     </w:p>
     <w:p>
       <w:pPr>
@@ -8527,21 +10254,7 @@
           <w:b/>
           <w:bCs/>
         </w:rPr>
-        <w:t xml:space="preserve">EXPERIMENTO </w:t>
-      </w:r>
-      <w:r>
-        <w:rPr>
-          <w:b/>
-          <w:bCs/>
-        </w:rPr>
-        <w:t>X</w:t>
-      </w:r>
-      <w:r>
-        <w:rPr>
-          <w:b/>
-          <w:bCs/>
-        </w:rPr>
-        <w:t xml:space="preserve"> </w:t>
+        <w:t>.</w:t>
       </w:r>
     </w:p>
     <w:p>

</xml_diff>